<commit_message>
Update resume. Change website link to linkedin link
</commit_message>
<xml_diff>
--- a/docs/Asiah_Crutchfield_Resume.docx
+++ b/docs/Asiah_Crutchfield_Resume.docx
@@ -66,14 +66,16 @@
         <w:rPr>
           <w:rFonts w:cs="Garamond"/>
           <w:color w:val="0000FF"/>
-          <w:sz w:val="22"/>
+          <w:sz w:val="20"/>
+          <w:szCs w:val="20"/>
           <w:lang w:eastAsia="zh-CN"/>
         </w:rPr>
       </w:pPr>
       <w:r>
         <w:rPr>
           <w:rFonts w:cs="Garamond"/>
-          <w:sz w:val="22"/>
+          <w:sz w:val="20"/>
+          <w:szCs w:val="20"/>
           <w:lang w:eastAsia="zh-CN"/>
         </w:rPr>
         <w:t>asiah@asiahcrutchfield.com |</w:t>
@@ -82,7 +84,8 @@
         <w:rPr>
           <w:rFonts w:cs="Garamond"/>
           <w:color w:val="000000"/>
-          <w:sz w:val="22"/>
+          <w:sz w:val="20"/>
+          <w:szCs w:val="20"/>
           <w:lang w:eastAsia="zh-CN"/>
         </w:rPr>
         <w:t xml:space="preserve"> </w:t>
@@ -90,7 +93,8 @@
       <w:r>
         <w:rPr>
           <w:rFonts w:cs="Garamond"/>
-          <w:sz w:val="22"/>
+          <w:sz w:val="20"/>
+          <w:szCs w:val="20"/>
           <w:lang w:eastAsia="zh-CN"/>
         </w:rPr>
         <w:t>0901-008-567 |</w:t>
@@ -99,7 +103,8 @@
         <w:rPr>
           <w:rFonts w:cs="Garamond"/>
           <w:color w:val="000000"/>
-          <w:sz w:val="22"/>
+          <w:sz w:val="20"/>
+          <w:szCs w:val="20"/>
           <w:lang w:eastAsia="zh-CN"/>
         </w:rPr>
         <w:t xml:space="preserve"> </w:t>
@@ -107,27 +112,52 @@
       <w:r>
         <w:rPr>
           <w:rFonts w:cs="Garamond"/>
-          <w:sz w:val="22"/>
+          <w:sz w:val="20"/>
+          <w:szCs w:val="20"/>
           <w:lang w:eastAsia="zh-CN"/>
         </w:rPr>
-        <w:t>Taoyuan City, Taiwan |</w:t>
+        <w:t>Taoyuan, Taiwan |</w:t>
+      </w:r>
+      <w:r>
+        <w:rPr>
+          <w:rFonts w:cs="Garamond"/>
+          <w:sz w:val="20"/>
+          <w:szCs w:val="20"/>
+          <w:lang w:eastAsia="zh-CN"/>
+        </w:rPr>
+        <w:t xml:space="preserve"> </w:t>
       </w:r>
       <w:hyperlink r:id="rId6">
         <w:r>
           <w:rPr>
             <w:rFonts w:cs="Garamond"/>
             <w:color w:val="1155CC"/>
-            <w:sz w:val="22"/>
+            <w:sz w:val="20"/>
+            <w:szCs w:val="20"/>
             <w:u w:val="single"/>
             <w:lang w:eastAsia="zh-CN"/>
           </w:rPr>
-          <w:t>asiahcrutchfield.com</w:t>
+          <w:t>linkedin.com/in/</w:t>
         </w:r>
+        <w:proofErr w:type="spellStart"/>
+        <w:r>
+          <w:rPr>
+            <w:rFonts w:cs="Garamond"/>
+            <w:color w:val="1155CC"/>
+            <w:sz w:val="20"/>
+            <w:szCs w:val="20"/>
+            <w:u w:val="single"/>
+            <w:lang w:eastAsia="zh-CN"/>
+          </w:rPr>
+          <w:t>asiahcrutchfield</w:t>
+        </w:r>
+        <w:proofErr w:type="spellEnd"/>
       </w:hyperlink>
       <w:r>
         <w:rPr>
           <w:rFonts w:ascii="Cambria" w:eastAsia="PMingLiU" w:hAnsi="Cambria" w:cs="Cambria"/>
-          <w:sz w:val="22"/>
+          <w:sz w:val="20"/>
+          <w:szCs w:val="20"/>
           <w:lang w:eastAsia="zh-CN"/>
         </w:rPr>
         <w:t xml:space="preserve"> | </w:t>
@@ -137,7 +167,8 @@
           <w:rPr>
             <w:rStyle w:val="Hyperlink"/>
             <w:rFonts w:cs="Garamond"/>
-            <w:sz w:val="22"/>
+            <w:sz w:val="20"/>
+            <w:szCs w:val="20"/>
             <w:lang w:eastAsia="zh-CN"/>
           </w:rPr>
           <w:t>github</w:t>
@@ -146,7 +177,8 @@
           <w:rPr>
             <w:rStyle w:val="Hyperlink"/>
             <w:rFonts w:ascii="Cambria" w:eastAsia="PMingLiU" w:hAnsi="Cambria" w:cs="Cambria"/>
-            <w:sz w:val="22"/>
+            <w:sz w:val="20"/>
+            <w:szCs w:val="20"/>
             <w:lang w:eastAsia="zh-CN"/>
           </w:rPr>
           <w:t>.com/</w:t>
@@ -156,7 +188,8 @@
           <w:rPr>
             <w:rStyle w:val="Hyperlink"/>
             <w:rFonts w:ascii="Cambria" w:eastAsia="PMingLiU" w:hAnsi="Cambria" w:cs="Cambria"/>
-            <w:sz w:val="22"/>
+            <w:sz w:val="20"/>
+            <w:szCs w:val="20"/>
             <w:lang w:eastAsia="zh-CN"/>
           </w:rPr>
           <w:t>asiahcrutchfield</w:t>
@@ -1279,7 +1312,6 @@
                 <w:szCs w:val="24"/>
               </w:rPr>
             </w:pPr>
-            <w:proofErr w:type="gramStart"/>
             <w:r>
               <w:rPr>
                 <w:i/>
@@ -1288,7 +1320,6 @@
               </w:rPr>
               <w:t>Bachelor's in Informatics</w:t>
             </w:r>
-            <w:proofErr w:type="gramEnd"/>
           </w:p>
         </w:tc>
         <w:tc>

</xml_diff>

<commit_message>
Update English and Chinese resume
</commit_message>
<xml_diff>
--- a/docs/Asiah_Crutchfield_Resume.docx
+++ b/docs/Asiah_Crutchfield_Resume.docx
@@ -1,6 +1,6 @@
 
 <file path=word/document.xml><?xml version="1.0" encoding="utf-8"?>
-<w:document xmlns:wpc="http://schemas.microsoft.com/office/word/2010/wordprocessingCanvas" xmlns:cx="http://schemas.microsoft.com/office/drawing/2014/chartex" xmlns:cx1="http://schemas.microsoft.com/office/drawing/2015/9/8/chartex" xmlns:cx2="http://schemas.microsoft.com/office/drawing/2015/10/21/chartex" xmlns:cx3="http://schemas.microsoft.com/office/drawing/2016/5/9/chartex" xmlns:cx4="http://schemas.microsoft.com/office/drawing/2016/5/10/chartex" xmlns:cx5="http://schemas.microsoft.com/office/drawing/2016/5/11/chartex" xmlns:cx6="http://schemas.microsoft.com/office/drawing/2016/5/12/chartex" xmlns:cx7="http://schemas.microsoft.com/office/drawing/2016/5/13/chartex" xmlns:cx8="http://schemas.microsoft.com/office/drawing/2016/5/14/chartex" xmlns:mc="http://schemas.openxmlformats.org/markup-compatibility/2006" xmlns:aink="http://schemas.microsoft.com/office/drawing/2016/ink" xmlns:am3d="http://schemas.microsoft.com/office/drawing/2017/model3d" xmlns:o="urn:schemas-microsoft-com:office:office" xmlns:oel="http://schemas.microsoft.com/office/2019/extlst" xmlns:r="http://schemas.openxmlformats.org/officeDocument/2006/relationships" xmlns:m="http://schemas.openxmlformats.org/officeDocument/2006/math" xmlns:v="urn:schemas-microsoft-com:vml" xmlns:wp14="http://schemas.microsoft.com/office/word/2010/wordprocessingDrawing" xmlns:wp="http://schemas.openxmlformats.org/drawingml/2006/wordprocessingDrawing" xmlns:w10="urn:schemas-microsoft-com:office:word" xmlns:w="http://schemas.openxmlformats.org/wordprocessingml/2006/main" xmlns:w14="http://schemas.microsoft.com/office/word/2010/wordml" xmlns:w15="http://schemas.microsoft.com/office/word/2012/wordml" xmlns:w16cex="http://schemas.microsoft.com/office/word/2018/wordml/cex" xmlns:w16cid="http://schemas.microsoft.com/office/word/2016/wordml/cid" xmlns:w16="http://schemas.microsoft.com/office/word/2018/wordml" xmlns:w16du="http://schemas.microsoft.com/office/word/2023/wordml/word16du" xmlns:w16sdtdh="http://schemas.microsoft.com/office/word/2020/wordml/sdtdatahash" xmlns:w16sdtfl="http://schemas.microsoft.com/office/word/2024/wordml/sdtformatlock" xmlns:w16se="http://schemas.microsoft.com/office/word/2015/wordml/symex" xmlns:wpg="http://schemas.microsoft.com/office/word/2010/wordprocessingGroup" xmlns:wpi="http://schemas.microsoft.com/office/word/2010/wordprocessingInk" xmlns:wne="http://schemas.microsoft.com/office/word/2006/wordml" xmlns:wps="http://schemas.microsoft.com/office/word/2010/wordprocessingShape" mc:Ignorable="w14 w15 w16se w16cid w16 w16cex w16sdtdh w16sdtfl w16du wp14">
+<w:document xmlns:wpc="http://schemas.microsoft.com/office/word/2010/wordprocessingCanvas" xmlns:cx="http://schemas.microsoft.com/office/drawing/2014/chartex" xmlns:cx1="http://schemas.microsoft.com/office/drawing/2015/9/8/chartex" xmlns:cx2="http://schemas.microsoft.com/office/drawing/2015/10/21/chartex" xmlns:cx3="http://schemas.microsoft.com/office/drawing/2016/5/9/chartex" xmlns:cx4="http://schemas.microsoft.com/office/drawing/2016/5/10/chartex" xmlns:cx5="http://schemas.microsoft.com/office/drawing/2016/5/11/chartex" xmlns:cx6="http://schemas.microsoft.com/office/drawing/2016/5/12/chartex" xmlns:cx7="http://schemas.microsoft.com/office/drawing/2016/5/13/chartex" xmlns:cx8="http://schemas.microsoft.com/office/drawing/2016/5/14/chartex" xmlns:mc="http://schemas.openxmlformats.org/markup-compatibility/2006" xmlns:aink="http://schemas.microsoft.com/office/drawing/2016/ink" xmlns:am3d="http://schemas.microsoft.com/office/drawing/2017/model3d" xmlns:o="urn:schemas-microsoft-com:office:office" xmlns:oel="http://schemas.microsoft.com/office/2019/extlst" xmlns:r="http://schemas.openxmlformats.org/officeDocument/2006/relationships" xmlns:m="http://schemas.openxmlformats.org/officeDocument/2006/math" xmlns:v="urn:schemas-microsoft-com:vml" xmlns:wp14="http://schemas.microsoft.com/office/word/2010/wordprocessingDrawing" xmlns:wp="http://schemas.openxmlformats.org/drawingml/2006/wordprocessingDrawing" xmlns:w10="urn:schemas-microsoft-com:office:word" xmlns:w="http://schemas.openxmlformats.org/wordprocessingml/2006/main" xmlns:w14="http://schemas.microsoft.com/office/word/2010/wordml" xmlns:w15="http://schemas.microsoft.com/office/word/2012/wordml" xmlns:w16cei="http://schemas.microsoft.com/office/word/2026/wordml/cei" xmlns:w16cex="http://schemas.microsoft.com/office/word/2018/wordml/cex" xmlns:w16cid="http://schemas.microsoft.com/office/word/2016/wordml/cid" xmlns:w16="http://schemas.microsoft.com/office/word/2018/wordml" xmlns:w16du="http://schemas.microsoft.com/office/word/2023/wordml/word16du" xmlns:w16sdtdh="http://schemas.microsoft.com/office/word/2020/wordml/sdtdatahash" xmlns:w16sdtfl="http://schemas.microsoft.com/office/word/2024/wordml/sdtformatlock" xmlns:w16se="http://schemas.microsoft.com/office/word/2015/wordml/symex" xmlns:wpg="http://schemas.microsoft.com/office/word/2010/wordprocessingGroup" xmlns:wpi="http://schemas.microsoft.com/office/word/2010/wordprocessingInk" xmlns:wne="http://schemas.microsoft.com/office/word/2006/wordml" xmlns:wps="http://schemas.microsoft.com/office/word/2010/wordprocessingShape" mc:Ignorable="w14 w15 w16se w16cid w16 w16cex w16sdtdh w16sdtfl w16du wp14">
   <w:body>
     <w:p>
       <w:pPr>
@@ -62,7 +62,7 @@
           <w:right w:val="nil"/>
           <w:between w:val="nil"/>
         </w:pBdr>
-        <w:spacing w:after="0"/>
+        <w:spacing w:after="0" w:line="240" w:lineRule="auto"/>
         <w:rPr>
           <w:rFonts w:cs="Garamond"/>
           <w:color w:val="0000FF"/>
@@ -127,7 +127,7 @@
         </w:rPr>
         <w:t xml:space="preserve"> </w:t>
       </w:r>
-      <w:hyperlink r:id="rId6">
+      <w:hyperlink r:id="rId8">
         <w:r>
           <w:rPr>
             <w:rFonts w:cs="Garamond"/>
@@ -137,21 +137,8 @@
             <w:u w:val="single"/>
             <w:lang w:eastAsia="zh-CN"/>
           </w:rPr>
-          <w:t>linkedin.com/in/</w:t>
+          <w:t>linkedin.com/in/asiahcrutchfield</w:t>
         </w:r>
-        <w:proofErr w:type="spellStart"/>
-        <w:r>
-          <w:rPr>
-            <w:rFonts w:cs="Garamond"/>
-            <w:color w:val="1155CC"/>
-            <w:sz w:val="20"/>
-            <w:szCs w:val="20"/>
-            <w:u w:val="single"/>
-            <w:lang w:eastAsia="zh-CN"/>
-          </w:rPr>
-          <w:t>asiahcrutchfield</w:t>
-        </w:r>
-        <w:proofErr w:type="spellEnd"/>
       </w:hyperlink>
       <w:r>
         <w:rPr>
@@ -162,7 +149,7 @@
         </w:rPr>
         <w:t xml:space="preserve"> | </w:t>
       </w:r>
-      <w:hyperlink r:id="rId7" w:history="1">
+      <w:hyperlink r:id="rId9" w:history="1">
         <w:r>
           <w:rPr>
             <w:rStyle w:val="Hyperlink"/>
@@ -181,32 +168,9 @@
             <w:szCs w:val="20"/>
             <w:lang w:eastAsia="zh-CN"/>
           </w:rPr>
-          <w:t>.com/</w:t>
+          <w:t>.com/asiahcrutchfield</w:t>
         </w:r>
-        <w:proofErr w:type="spellStart"/>
-        <w:r>
-          <w:rPr>
-            <w:rStyle w:val="Hyperlink"/>
-            <w:rFonts w:ascii="Cambria" w:eastAsia="PMingLiU" w:hAnsi="Cambria" w:cs="Cambria"/>
-            <w:sz w:val="20"/>
-            <w:szCs w:val="20"/>
-            <w:lang w:eastAsia="zh-CN"/>
-          </w:rPr>
-          <w:t>asiahcrutchfield</w:t>
-        </w:r>
-        <w:proofErr w:type="spellEnd"/>
       </w:hyperlink>
-    </w:p>
-    <w:p>
-      <w:pPr>
-        <w:spacing w:after="0"/>
-        <w:jc w:val="center"/>
-        <w:rPr>
-          <w:b/>
-          <w:i/>
-          <w:sz w:val="21"/>
-        </w:rPr>
-      </w:pPr>
     </w:p>
     <w:p>
       <w:pPr>
@@ -260,15 +224,7 @@
     </w:p>
     <w:p>
       <w:pPr>
-        <w:widowControl w:val="0"/>
-        <w:pBdr>
-          <w:top w:val="nil"/>
-          <w:left w:val="nil"/>
-          <w:bottom w:val="nil"/>
-          <w:right w:val="nil"/>
-          <w:between w:val="nil"/>
-        </w:pBdr>
-        <w:spacing w:after="0" w:line="252" w:lineRule="auto"/>
+        <w:spacing w:after="60" w:line="240" w:lineRule="auto"/>
         <w:jc w:val="center"/>
         <w:rPr>
           <w:sz w:val="24"/>
@@ -280,47 +236,15 @@
           <w:sz w:val="24"/>
           <w:szCs w:val="24"/>
         </w:rPr>
-        <w:t>Frontend &amp; Web Projects | IT Support | QA/Testing | AI-Assisted Workflows</w:t>
+        <w:t>Software | Computer Architecture | IT Support | QA/Testing</w:t>
       </w:r>
-    </w:p>
-    <w:p>
-      <w:pPr>
-        <w:widowControl w:val="0"/>
-        <w:pBdr>
-          <w:top w:val="nil"/>
-          <w:left w:val="nil"/>
-          <w:bottom w:val="nil"/>
-          <w:right w:val="nil"/>
-          <w:between w:val="nil"/>
-        </w:pBdr>
-        <w:spacing w:after="0" w:line="252" w:lineRule="auto"/>
-        <w:jc w:val="center"/>
-      </w:pPr>
-    </w:p>
-    <w:p>
-      <w:pPr>
-        <w:spacing w:after="60" w:line="240" w:lineRule="auto"/>
-        <w:rPr>
-          <w:sz w:val="24"/>
-          <w:szCs w:val="24"/>
-        </w:rPr>
-      </w:pPr>
       <w:r>
         <w:rPr>
           <w:sz w:val="24"/>
           <w:szCs w:val="24"/>
         </w:rPr>
-        <w:t>Informatics student at Yuan Ze University with experience in IT support, data reporting, troubleshooting, and web-based project development. Building frontend projects with JavaScript, TypeScript, HTML/CSS, and Vite, with interests in QA/testing, software development, engineering support, and AI-assisted workflows. Holds a Taiwan student work permit.</w:t>
+        <w:t xml:space="preserve"> | AI</w:t>
       </w:r>
-    </w:p>
-    <w:p>
-      <w:pPr>
-        <w:spacing w:after="60" w:line="240" w:lineRule="auto"/>
-        <w:rPr>
-          <w:sz w:val="24"/>
-          <w:szCs w:val="24"/>
-        </w:rPr>
-      </w:pPr>
     </w:p>
     <w:p>
       <w:pPr>
@@ -335,88 +259,10 @@
       </w:pPr>
       <w:r>
         <w:rPr>
-          <w:b/>
           <w:sz w:val="24"/>
           <w:szCs w:val="24"/>
         </w:rPr>
-        <w:t>TECHNICAL SKILLS</w:t>
-      </w:r>
-    </w:p>
-    <w:p>
-      <w:pPr>
-        <w:pStyle w:val="ListParagraph"/>
-        <w:numPr>
-          <w:ilvl w:val="0"/>
-          <w:numId w:val="10"/>
-        </w:numPr>
-        <w:spacing w:after="0" w:line="240" w:lineRule="auto"/>
-        <w:rPr>
-          <w:sz w:val="24"/>
-          <w:szCs w:val="24"/>
-        </w:rPr>
-      </w:pPr>
-      <w:r>
-        <w:rPr>
-          <w:sz w:val="24"/>
-          <w:szCs w:val="24"/>
-        </w:rPr>
-        <w:t>Languages: JavaScript, TypeScript, HTML, CSS; C++ and Python (coursework/basic)</w:t>
-      </w:r>
-    </w:p>
-    <w:p>
-      <w:pPr>
-        <w:pStyle w:val="ListParagraph"/>
-        <w:numPr>
-          <w:ilvl w:val="0"/>
-          <w:numId w:val="10"/>
-        </w:numPr>
-        <w:spacing w:after="0" w:line="240" w:lineRule="auto"/>
-        <w:rPr>
-          <w:sz w:val="24"/>
-          <w:szCs w:val="24"/>
-        </w:rPr>
-      </w:pPr>
-      <w:r>
-        <w:rPr>
-          <w:sz w:val="24"/>
-          <w:szCs w:val="24"/>
-        </w:rPr>
-        <w:t>Tools: Git, GitHub, VS Code, Excel, Windows, macOS, Vite</w:t>
-      </w:r>
-    </w:p>
-    <w:p>
-      <w:pPr>
-        <w:pStyle w:val="ListParagraph"/>
-        <w:numPr>
-          <w:ilvl w:val="0"/>
-          <w:numId w:val="10"/>
-        </w:numPr>
-        <w:spacing w:after="0" w:line="240" w:lineRule="auto"/>
-        <w:rPr>
-          <w:sz w:val="24"/>
-          <w:szCs w:val="24"/>
-        </w:rPr>
-      </w:pPr>
-      <w:r>
-        <w:rPr>
-          <w:sz w:val="24"/>
-          <w:szCs w:val="24"/>
-        </w:rPr>
-        <w:t xml:space="preserve">Focus: Frontend development, </w:t>
-      </w:r>
-      <w:r>
-        <w:rPr>
-          <w:sz w:val="24"/>
-          <w:szCs w:val="24"/>
-        </w:rPr>
-        <w:t>JSON/data workflows</w:t>
-      </w:r>
-      <w:r>
-        <w:rPr>
-          <w:sz w:val="24"/>
-          <w:szCs w:val="24"/>
-        </w:rPr>
-        <w:t>, technical documentation, product UX</w:t>
+        <w:t>Informatics student at Yuan Ze University with experience in IT support, troubleshooting, and project-based software development. Building hands-on projects across frontend development and computer architecture, with interests in software engineering, QA/testing, and technical systems. Holds a Taiwan student work permit.</w:t>
       </w:r>
     </w:p>
     <w:p>
@@ -456,8 +302,270 @@
       </w:tblPr>
       <w:tblGrid>
         <w:gridCol w:w="8226"/>
-        <w:gridCol w:w="2880"/>
+        <w:gridCol w:w="2727"/>
+        <w:gridCol w:w="153"/>
       </w:tblGrid>
+      <w:tr>
+        <w:trPr>
+          <w:gridAfter w:val="1"/>
+          <w:wAfter w:w="153" w:type="dxa"/>
+          <w:jc w:val="center"/>
+        </w:trPr>
+        <w:tc>
+          <w:tcPr>
+            <w:tcW w:w="8226" w:type="dxa"/>
+          </w:tcPr>
+          <w:tbl>
+            <w:tblPr>
+              <w:tblW w:w="5636" w:type="dxa"/>
+              <w:tblBorders>
+                <w:top w:val="single" w:sz="2" w:space="0" w:color="auto"/>
+                <w:left w:val="single" w:sz="2" w:space="0" w:color="auto"/>
+                <w:bottom w:val="single" w:sz="2" w:space="0" w:color="auto"/>
+                <w:right w:val="single" w:sz="2" w:space="0" w:color="auto"/>
+              </w:tblBorders>
+              <w:shd w:val="clear" w:color="auto" w:fill="FFFFFF"/>
+              <w:tblLook w:val="04A0" w:firstRow="1" w:lastRow="0" w:firstColumn="1" w:lastColumn="0" w:noHBand="0" w:noVBand="1"/>
+            </w:tblPr>
+            <w:tblGrid>
+              <w:gridCol w:w="5400"/>
+              <w:gridCol w:w="236"/>
+            </w:tblGrid>
+            <w:tr>
+              <w:tc>
+                <w:tcPr>
+                  <w:tcW w:w="5400" w:type="dxa"/>
+                  <w:tcBorders>
+                    <w:top w:val="nil"/>
+                    <w:left w:val="nil"/>
+                    <w:bottom w:val="nil"/>
+                    <w:right w:val="nil"/>
+                  </w:tcBorders>
+                  <w:shd w:val="clear" w:color="auto" w:fill="FFFFFF"/>
+                  <w:tcMar>
+                    <w:top w:w="0" w:type="dxa"/>
+                    <w:left w:w="0" w:type="dxa"/>
+                    <w:bottom w:w="0" w:type="dxa"/>
+                    <w:right w:w="0" w:type="dxa"/>
+                  </w:tcMar>
+                  <w:hideMark/>
+                </w:tcPr>
+                <w:p>
+                  <w:pPr>
+                    <w:spacing w:after="0" w:line="240" w:lineRule="auto"/>
+                    <w:rPr>
+                      <w:b/>
+                      <w:sz w:val="24"/>
+                      <w:szCs w:val="24"/>
+                    </w:rPr>
+                  </w:pPr>
+                  <w:r>
+                    <w:rPr>
+                      <w:b/>
+                      <w:bCs/>
+                      <w:sz w:val="24"/>
+                      <w:szCs w:val="24"/>
+                    </w:rPr>
+                    <w:t>8-Bit CPU Architecture &amp; Simulation</w:t>
+                  </w:r>
+                </w:p>
+              </w:tc>
+              <w:tc>
+                <w:tcPr>
+                  <w:tcW w:w="236" w:type="dxa"/>
+                  <w:tcBorders>
+                    <w:top w:val="nil"/>
+                    <w:left w:val="nil"/>
+                    <w:bottom w:val="nil"/>
+                    <w:right w:val="nil"/>
+                  </w:tcBorders>
+                  <w:shd w:val="clear" w:color="auto" w:fill="FFFFFF"/>
+                </w:tcPr>
+                <w:p>
+                  <w:pPr>
+                    <w:spacing w:after="0" w:line="240" w:lineRule="auto"/>
+                    <w:rPr>
+                      <w:b/>
+                      <w:sz w:val="24"/>
+                      <w:szCs w:val="24"/>
+                    </w:rPr>
+                  </w:pPr>
+                </w:p>
+              </w:tc>
+            </w:tr>
+            <w:tr>
+              <w:tc>
+                <w:tcPr>
+                  <w:tcW w:w="5400" w:type="dxa"/>
+                  <w:tcBorders>
+                    <w:top w:val="nil"/>
+                    <w:left w:val="nil"/>
+                    <w:bottom w:val="nil"/>
+                    <w:right w:val="nil"/>
+                  </w:tcBorders>
+                  <w:shd w:val="clear" w:color="auto" w:fill="FFFFFF"/>
+                  <w:tcMar>
+                    <w:top w:w="0" w:type="dxa"/>
+                    <w:left w:w="0" w:type="dxa"/>
+                    <w:bottom w:w="0" w:type="dxa"/>
+                    <w:right w:w="0" w:type="dxa"/>
+                  </w:tcMar>
+                </w:tcPr>
+                <w:p>
+                  <w:pPr>
+                    <w:spacing w:after="0" w:line="240" w:lineRule="auto"/>
+                    <w:rPr>
+                      <w:b/>
+                      <w:bCs/>
+                      <w:i/>
+                      <w:iCs/>
+                      <w:sz w:val="24"/>
+                      <w:szCs w:val="24"/>
+                    </w:rPr>
+                  </w:pPr>
+                  <w:r>
+                    <w:rPr>
+                      <w:bCs/>
+                      <w:i/>
+                      <w:iCs/>
+                      <w:sz w:val="24"/>
+                      <w:szCs w:val="24"/>
+                    </w:rPr>
+                    <w:t>Self-Directed</w:t>
+                  </w:r>
+                  <w:r>
+                    <w:rPr>
+                      <w:bCs/>
+                      <w:i/>
+                      <w:iCs/>
+                      <w:sz w:val="24"/>
+                      <w:szCs w:val="24"/>
+                    </w:rPr>
+                    <w:t xml:space="preserve"> Computer Architecture Project</w:t>
+                  </w:r>
+                </w:p>
+              </w:tc>
+              <w:tc>
+                <w:tcPr>
+                  <w:tcW w:w="236" w:type="dxa"/>
+                  <w:tcBorders>
+                    <w:top w:val="nil"/>
+                    <w:left w:val="nil"/>
+                    <w:bottom w:val="nil"/>
+                    <w:right w:val="nil"/>
+                  </w:tcBorders>
+                  <w:shd w:val="clear" w:color="auto" w:fill="FFFFFF"/>
+                </w:tcPr>
+                <w:p>
+                  <w:pPr>
+                    <w:spacing w:after="0" w:line="240" w:lineRule="auto"/>
+                    <w:rPr>
+                      <w:b/>
+                      <w:sz w:val="24"/>
+                      <w:szCs w:val="24"/>
+                    </w:rPr>
+                  </w:pPr>
+                </w:p>
+              </w:tc>
+            </w:tr>
+          </w:tbl>
+          <w:p>
+            <w:pPr>
+              <w:pStyle w:val="ListParagraph"/>
+              <w:numPr>
+                <w:ilvl w:val="0"/>
+                <w:numId w:val="14"/>
+              </w:numPr>
+              <w:spacing w:after="0" w:line="240" w:lineRule="auto"/>
+              <w:rPr>
+                <w:bCs/>
+                <w:sz w:val="24"/>
+                <w:szCs w:val="24"/>
+              </w:rPr>
+            </w:pPr>
+            <w:r>
+              <w:rPr>
+                <w:bCs/>
+                <w:sz w:val="24"/>
+                <w:szCs w:val="24"/>
+              </w:rPr>
+              <w:t>Built and simulated a SAP-1-inspired 8-bit CPU from digital logic components to explore computer architecture at the binary level.</w:t>
+            </w:r>
+          </w:p>
+          <w:p>
+            <w:pPr>
+              <w:pStyle w:val="ListParagraph"/>
+              <w:numPr>
+                <w:ilvl w:val="0"/>
+                <w:numId w:val="14"/>
+              </w:numPr>
+              <w:spacing w:after="0" w:line="240" w:lineRule="auto"/>
+              <w:rPr>
+                <w:b/>
+                <w:sz w:val="24"/>
+                <w:szCs w:val="24"/>
+              </w:rPr>
+            </w:pPr>
+            <w:r>
+              <w:rPr>
+                <w:bCs/>
+                <w:sz w:val="24"/>
+                <w:szCs w:val="24"/>
+              </w:rPr>
+              <w:t>Implemented an 8-bit ALU for binary addition/subtraction, plus registers, RAM, and a program counter using latches and flip-flops</w:t>
+            </w:r>
+            <w:r>
+              <w:rPr>
+                <w:b/>
+                <w:sz w:val="24"/>
+                <w:szCs w:val="24"/>
+              </w:rPr>
+              <w:t>.</w:t>
+            </w:r>
+          </w:p>
+        </w:tc>
+        <w:tc>
+          <w:tcPr>
+            <w:tcW w:w="2727" w:type="dxa"/>
+          </w:tcPr>
+          <w:p>
+            <w:pPr>
+              <w:spacing w:after="0" w:line="240" w:lineRule="auto"/>
+              <w:ind w:right="-75"/>
+              <w:jc w:val="right"/>
+              <w:rPr>
+                <w:b/>
+                <w:sz w:val="24"/>
+                <w:szCs w:val="24"/>
+              </w:rPr>
+            </w:pPr>
+            <w:r>
+              <w:rPr>
+                <w:b/>
+                <w:sz w:val="24"/>
+                <w:szCs w:val="24"/>
+              </w:rPr>
+              <w:t xml:space="preserve">Aug. </w:t>
+            </w:r>
+            <w:r>
+              <w:rPr>
+                <w:b/>
+                <w:sz w:val="24"/>
+                <w:szCs w:val="24"/>
+              </w:rPr>
+              <w:t>202</w:t>
+            </w:r>
+            <w:r>
+              <w:rPr>
+                <w:b/>
+                <w:sz w:val="24"/>
+                <w:szCs w:val="24"/>
+              </w:rPr>
+              <w:t>6 - Present</w:t>
+            </w:r>
+          </w:p>
+        </w:tc>
+      </w:tr>
       <w:tr>
         <w:trPr>
           <w:jc w:val="center"/>
@@ -487,6 +595,7 @@
         <w:tc>
           <w:tcPr>
             <w:tcW w:w="2880" w:type="dxa"/>
+            <w:gridSpan w:val="2"/>
           </w:tcPr>
           <w:p>
             <w:pPr>
@@ -497,14 +606,6 @@
                 <w:szCs w:val="24"/>
               </w:rPr>
             </w:pPr>
-            <w:r>
-              <w:rPr>
-                <w:b/>
-                <w:sz w:val="24"/>
-                <w:szCs w:val="24"/>
-              </w:rPr>
-              <w:t>2026</w:t>
-            </w:r>
           </w:p>
         </w:tc>
       </w:tr>
@@ -537,6 +638,7 @@
         <w:tc>
           <w:tcPr>
             <w:tcW w:w="2880" w:type="dxa"/>
+            <w:gridSpan w:val="2"/>
           </w:tcPr>
           <w:p>
             <w:pPr>
@@ -636,7 +738,15 @@
                 <w:sz w:val="24"/>
                 <w:szCs w:val="24"/>
               </w:rPr>
-              <w:t>2026</w:t>
+              <w:t>202</w:t>
+            </w:r>
+            <w:r>
+              <w:rPr>
+                <w:b/>
+                <w:sz w:val="24"/>
+                <w:szCs w:val="24"/>
+              </w:rPr>
+              <w:t>6</w:t>
             </w:r>
           </w:p>
         </w:tc>
@@ -684,27 +794,6 @@
         </w:tc>
       </w:tr>
     </w:tbl>
-    <w:p>
-      <w:pPr>
-        <w:pStyle w:val="ListParagraph"/>
-        <w:numPr>
-          <w:ilvl w:val="0"/>
-          <w:numId w:val="11"/>
-        </w:numPr>
-        <w:spacing w:after="0" w:line="240" w:lineRule="auto"/>
-        <w:rPr>
-          <w:sz w:val="24"/>
-          <w:szCs w:val="24"/>
-        </w:rPr>
-      </w:pPr>
-      <w:r>
-        <w:rPr>
-          <w:sz w:val="24"/>
-          <w:szCs w:val="24"/>
-        </w:rPr>
-        <w:t>Created a browser-based game prototype with interactive UI, debugging, asset organization, character/story concepts, and user experience design.</w:t>
-      </w:r>
-    </w:p>
     <w:p>
       <w:pPr>
         <w:pStyle w:val="ListParagraph"/>
@@ -790,7 +879,15 @@
                 <w:sz w:val="24"/>
                 <w:szCs w:val="24"/>
               </w:rPr>
-              <w:t>2026</w:t>
+              <w:t>202</w:t>
+            </w:r>
+            <w:r>
+              <w:rPr>
+                <w:b/>
+                <w:sz w:val="24"/>
+                <w:szCs w:val="24"/>
+              </w:rPr>
+              <w:t>5 - Present</w:t>
             </w:r>
           </w:p>
         </w:tc>
@@ -843,10 +940,11 @@
         <w:pStyle w:val="ListParagraph"/>
         <w:numPr>
           <w:ilvl w:val="0"/>
-          <w:numId w:val="12"/>
+          <w:numId w:val="16"/>
         </w:numPr>
-        <w:spacing w:after="0" w:line="240" w:lineRule="auto"/>
+        <w:spacing w:before="80" w:after="0" w:line="240" w:lineRule="auto"/>
         <w:rPr>
+          <w:b/>
           <w:sz w:val="24"/>
           <w:szCs w:val="24"/>
         </w:rPr>
@@ -858,7 +956,259 @@
         </w:rPr>
         <w:t>Built and maintained a portfolio website documenting projects, software learning, design decisions, and development process.</w:t>
       </w:r>
+      <w:r>
+        <w:rPr>
+          <w:b/>
+          <w:sz w:val="24"/>
+          <w:szCs w:val="24"/>
+        </w:rPr>
+        <w:t xml:space="preserve"> </w:t>
+      </w:r>
     </w:p>
+    <w:p>
+      <w:pPr>
+        <w:pBdr>
+          <w:bottom w:val="single" w:sz="6" w:space="1" w:color="000000"/>
+        </w:pBdr>
+        <w:spacing w:before="80" w:after="0" w:line="240" w:lineRule="auto"/>
+        <w:rPr>
+          <w:sz w:val="24"/>
+          <w:szCs w:val="24"/>
+        </w:rPr>
+      </w:pPr>
+      <w:r>
+        <w:rPr>
+          <w:b/>
+          <w:sz w:val="24"/>
+          <w:szCs w:val="24"/>
+        </w:rPr>
+        <w:t>TECHNICAL SKILLS</w:t>
+      </w:r>
+    </w:p>
+    <w:p>
+      <w:pPr>
+        <w:pStyle w:val="ListParagraph"/>
+        <w:numPr>
+          <w:ilvl w:val="0"/>
+          <w:numId w:val="10"/>
+        </w:numPr>
+        <w:spacing w:after="0" w:line="240" w:lineRule="auto"/>
+        <w:rPr>
+          <w:sz w:val="24"/>
+          <w:szCs w:val="24"/>
+        </w:rPr>
+      </w:pPr>
+      <w:r>
+        <w:rPr>
+          <w:sz w:val="24"/>
+          <w:szCs w:val="24"/>
+        </w:rPr>
+        <w:t>Languages: JavaScript, TypeScript, HTML, CSS; C++ and Python (coursework/basic)</w:t>
+      </w:r>
+    </w:p>
+    <w:p>
+      <w:pPr>
+        <w:pStyle w:val="ListParagraph"/>
+        <w:numPr>
+          <w:ilvl w:val="0"/>
+          <w:numId w:val="10"/>
+        </w:numPr>
+        <w:spacing w:after="0" w:line="240" w:lineRule="auto"/>
+        <w:rPr>
+          <w:sz w:val="24"/>
+          <w:szCs w:val="24"/>
+        </w:rPr>
+      </w:pPr>
+      <w:r>
+        <w:rPr>
+          <w:sz w:val="24"/>
+          <w:szCs w:val="24"/>
+        </w:rPr>
+        <w:t>Tools: Git, GitHub, VS Code, Excel, Windows, macOS, Vite</w:t>
+      </w:r>
+      <w:r>
+        <w:rPr>
+          <w:sz w:val="24"/>
+          <w:szCs w:val="24"/>
+        </w:rPr>
+        <w:t>, Digital</w:t>
+      </w:r>
+    </w:p>
+    <w:p>
+      <w:pPr>
+        <w:pStyle w:val="ListParagraph"/>
+        <w:numPr>
+          <w:ilvl w:val="0"/>
+          <w:numId w:val="10"/>
+        </w:numPr>
+        <w:spacing w:after="0" w:line="240" w:lineRule="auto"/>
+        <w:rPr>
+          <w:sz w:val="24"/>
+          <w:szCs w:val="24"/>
+        </w:rPr>
+      </w:pPr>
+      <w:r>
+        <w:rPr>
+          <w:sz w:val="24"/>
+          <w:szCs w:val="24"/>
+        </w:rPr>
+        <w:t>Technical Areas</w:t>
+      </w:r>
+      <w:r>
+        <w:rPr>
+          <w:sz w:val="24"/>
+          <w:szCs w:val="24"/>
+        </w:rPr>
+        <w:t xml:space="preserve">: </w:t>
+      </w:r>
+      <w:r>
+        <w:rPr>
+          <w:sz w:val="24"/>
+          <w:szCs w:val="24"/>
+        </w:rPr>
+        <w:t>Frontend Development, JSON/Data Workflows, Computer Architecture, QA/Testing</w:t>
+      </w:r>
+      <w:r>
+        <w:rPr>
+          <w:sz w:val="24"/>
+          <w:szCs w:val="24"/>
+        </w:rPr>
+        <w:t>, AI</w:t>
+      </w:r>
+    </w:p>
+    <w:p>
+      <w:pPr>
+        <w:pBdr>
+          <w:bottom w:val="single" w:sz="6" w:space="1" w:color="000000"/>
+        </w:pBdr>
+        <w:spacing w:before="80" w:after="0" w:line="240" w:lineRule="auto"/>
+        <w:rPr>
+          <w:sz w:val="24"/>
+          <w:szCs w:val="24"/>
+        </w:rPr>
+      </w:pPr>
+      <w:r>
+        <w:rPr>
+          <w:b/>
+          <w:sz w:val="24"/>
+          <w:szCs w:val="24"/>
+        </w:rPr>
+        <w:t>EDUCATION</w:t>
+      </w:r>
+    </w:p>
+    <w:tbl>
+      <w:tblPr>
+        <w:tblW w:w="10998" w:type="dxa"/>
+        <w:tblBorders>
+          <w:top w:val="nil"/>
+          <w:left w:val="nil"/>
+          <w:bottom w:val="nil"/>
+          <w:right w:val="nil"/>
+          <w:insideH w:val="nil"/>
+          <w:insideV w:val="nil"/>
+        </w:tblBorders>
+        <w:tblLayout w:type="fixed"/>
+        <w:tblLook w:val="04A0" w:firstRow="1" w:lastRow="0" w:firstColumn="1" w:lastColumn="0" w:noHBand="0" w:noVBand="1"/>
+      </w:tblPr>
+      <w:tblGrid>
+        <w:gridCol w:w="8352"/>
+        <w:gridCol w:w="2646"/>
+      </w:tblGrid>
+      <w:tr>
+        <w:tc>
+          <w:tcPr>
+            <w:tcW w:w="8352" w:type="dxa"/>
+          </w:tcPr>
+          <w:p>
+            <w:pPr>
+              <w:spacing w:after="0" w:line="240" w:lineRule="auto"/>
+              <w:rPr>
+                <w:sz w:val="24"/>
+                <w:szCs w:val="24"/>
+              </w:rPr>
+            </w:pPr>
+            <w:r>
+              <w:rPr>
+                <w:b/>
+                <w:sz w:val="24"/>
+                <w:szCs w:val="24"/>
+              </w:rPr>
+              <w:t>Yuan Ze University</w:t>
+            </w:r>
+          </w:p>
+        </w:tc>
+        <w:tc>
+          <w:tcPr>
+            <w:tcW w:w="2646" w:type="dxa"/>
+          </w:tcPr>
+          <w:p>
+            <w:pPr>
+              <w:spacing w:after="0" w:line="240" w:lineRule="auto"/>
+              <w:jc w:val="right"/>
+              <w:rPr>
+                <w:sz w:val="24"/>
+                <w:szCs w:val="24"/>
+              </w:rPr>
+            </w:pPr>
+            <w:r>
+              <w:rPr>
+                <w:b/>
+                <w:sz w:val="24"/>
+                <w:szCs w:val="24"/>
+              </w:rPr>
+              <w:t>Expected 2028</w:t>
+            </w:r>
+          </w:p>
+        </w:tc>
+      </w:tr>
+      <w:tr>
+        <w:tc>
+          <w:tcPr>
+            <w:tcW w:w="8352" w:type="dxa"/>
+          </w:tcPr>
+          <w:p>
+            <w:pPr>
+              <w:spacing w:after="0" w:line="240" w:lineRule="auto"/>
+              <w:rPr>
+                <w:sz w:val="24"/>
+                <w:szCs w:val="24"/>
+              </w:rPr>
+            </w:pPr>
+            <w:r>
+              <w:rPr>
+                <w:i/>
+                <w:sz w:val="24"/>
+                <w:szCs w:val="24"/>
+              </w:rPr>
+              <w:t>Bachelor's in Informatics</w:t>
+            </w:r>
+          </w:p>
+        </w:tc>
+        <w:tc>
+          <w:tcPr>
+            <w:tcW w:w="2646" w:type="dxa"/>
+          </w:tcPr>
+          <w:p>
+            <w:pPr>
+              <w:spacing w:after="0" w:line="240" w:lineRule="auto"/>
+              <w:jc w:val="right"/>
+              <w:rPr>
+                <w:sz w:val="24"/>
+                <w:szCs w:val="24"/>
+              </w:rPr>
+            </w:pPr>
+            <w:r>
+              <w:rPr>
+                <w:i/>
+                <w:sz w:val="24"/>
+                <w:szCs w:val="24"/>
+              </w:rPr>
+              <w:t>Taoyuan City, Taiwan</w:t>
+            </w:r>
+          </w:p>
+        </w:tc>
+      </w:tr>
+    </w:tbl>
     <w:p>
       <w:pPr>
         <w:pBdr>
@@ -1150,6 +1500,8 @@
       </w:r>
       <w:r>
         <w:rPr>
+          <w:b/>
+          <w:bCs/>
           <w:sz w:val="24"/>
           <w:szCs w:val="24"/>
         </w:rPr>
@@ -1204,149 +1556,17 @@
           <w:szCs w:val="24"/>
         </w:rPr>
         <w:tab/>
-        <w:t xml:space="preserve">     </w:t>
       </w:r>
       <w:r>
         <w:rPr>
+          <w:b/>
+          <w:bCs/>
           <w:sz w:val="24"/>
           <w:szCs w:val="24"/>
         </w:rPr>
-        <w:t>2015 – 2017</w:t>
+        <w:t xml:space="preserve">     2015 – 2017</w:t>
       </w:r>
     </w:p>
-    <w:p>
-      <w:pPr>
-        <w:pBdr>
-          <w:bottom w:val="single" w:sz="6" w:space="1" w:color="000000"/>
-        </w:pBdr>
-        <w:spacing w:before="80" w:after="0" w:line="240" w:lineRule="auto"/>
-        <w:rPr>
-          <w:sz w:val="24"/>
-          <w:szCs w:val="24"/>
-        </w:rPr>
-      </w:pPr>
-      <w:r>
-        <w:rPr>
-          <w:b/>
-          <w:sz w:val="24"/>
-          <w:szCs w:val="24"/>
-        </w:rPr>
-        <w:t>EDUCATION</w:t>
-      </w:r>
-    </w:p>
-    <w:tbl>
-      <w:tblPr>
-        <w:tblW w:w="10998" w:type="dxa"/>
-        <w:tblBorders>
-          <w:top w:val="nil"/>
-          <w:left w:val="nil"/>
-          <w:bottom w:val="nil"/>
-          <w:right w:val="nil"/>
-          <w:insideH w:val="nil"/>
-          <w:insideV w:val="nil"/>
-        </w:tblBorders>
-        <w:tblLayout w:type="fixed"/>
-        <w:tblLook w:val="04A0" w:firstRow="1" w:lastRow="0" w:firstColumn="1" w:lastColumn="0" w:noHBand="0" w:noVBand="1"/>
-      </w:tblPr>
-      <w:tblGrid>
-        <w:gridCol w:w="8352"/>
-        <w:gridCol w:w="2646"/>
-      </w:tblGrid>
-      <w:tr>
-        <w:tc>
-          <w:tcPr>
-            <w:tcW w:w="8352" w:type="dxa"/>
-          </w:tcPr>
-          <w:p>
-            <w:pPr>
-              <w:spacing w:after="0" w:line="240" w:lineRule="auto"/>
-              <w:rPr>
-                <w:sz w:val="24"/>
-                <w:szCs w:val="24"/>
-              </w:rPr>
-            </w:pPr>
-            <w:r>
-              <w:rPr>
-                <w:b/>
-                <w:sz w:val="24"/>
-                <w:szCs w:val="24"/>
-              </w:rPr>
-              <w:t>Yuan Ze University</w:t>
-            </w:r>
-          </w:p>
-        </w:tc>
-        <w:tc>
-          <w:tcPr>
-            <w:tcW w:w="2646" w:type="dxa"/>
-          </w:tcPr>
-          <w:p>
-            <w:pPr>
-              <w:spacing w:after="0" w:line="240" w:lineRule="auto"/>
-              <w:jc w:val="right"/>
-              <w:rPr>
-                <w:sz w:val="24"/>
-                <w:szCs w:val="24"/>
-              </w:rPr>
-            </w:pPr>
-            <w:r>
-              <w:rPr>
-                <w:b/>
-                <w:sz w:val="24"/>
-                <w:szCs w:val="24"/>
-              </w:rPr>
-              <w:t>Expected 2028</w:t>
-            </w:r>
-          </w:p>
-        </w:tc>
-      </w:tr>
-      <w:tr>
-        <w:tc>
-          <w:tcPr>
-            <w:tcW w:w="8352" w:type="dxa"/>
-          </w:tcPr>
-          <w:p>
-            <w:pPr>
-              <w:spacing w:after="0" w:line="240" w:lineRule="auto"/>
-              <w:rPr>
-                <w:sz w:val="24"/>
-                <w:szCs w:val="24"/>
-              </w:rPr>
-            </w:pPr>
-            <w:r>
-              <w:rPr>
-                <w:i/>
-                <w:sz w:val="24"/>
-                <w:szCs w:val="24"/>
-              </w:rPr>
-              <w:t>Bachelor's in Informatics</w:t>
-            </w:r>
-          </w:p>
-        </w:tc>
-        <w:tc>
-          <w:tcPr>
-            <w:tcW w:w="2646" w:type="dxa"/>
-          </w:tcPr>
-          <w:p>
-            <w:pPr>
-              <w:spacing w:after="0" w:line="240" w:lineRule="auto"/>
-              <w:jc w:val="right"/>
-              <w:rPr>
-                <w:sz w:val="24"/>
-                <w:szCs w:val="24"/>
-              </w:rPr>
-            </w:pPr>
-            <w:r>
-              <w:rPr>
-                <w:i/>
-                <w:sz w:val="24"/>
-                <w:szCs w:val="24"/>
-              </w:rPr>
-              <w:t>Taoyuan City, Taiwan</w:t>
-            </w:r>
-          </w:p>
-        </w:tc>
-      </w:tr>
-    </w:tbl>
     <w:p>
       <w:pPr>
         <w:pBdr>
@@ -1393,8 +1613,58 @@
 </w:document>
 </file>
 
+<file path=word/endnotes.xml><?xml version="1.0" encoding="utf-8"?>
+<w:endnotes xmlns:wpc="http://schemas.microsoft.com/office/word/2010/wordprocessingCanvas" xmlns:cx="http://schemas.microsoft.com/office/drawing/2014/chartex" xmlns:cx1="http://schemas.microsoft.com/office/drawing/2015/9/8/chartex" xmlns:cx2="http://schemas.microsoft.com/office/drawing/2015/10/21/chartex" xmlns:cx3="http://schemas.microsoft.com/office/drawing/2016/5/9/chartex" xmlns:cx4="http://schemas.microsoft.com/office/drawing/2016/5/10/chartex" xmlns:cx5="http://schemas.microsoft.com/office/drawing/2016/5/11/chartex" xmlns:cx6="http://schemas.microsoft.com/office/drawing/2016/5/12/chartex" xmlns:cx7="http://schemas.microsoft.com/office/drawing/2016/5/13/chartex" xmlns:cx8="http://schemas.microsoft.com/office/drawing/2016/5/14/chartex" xmlns:mc="http://schemas.openxmlformats.org/markup-compatibility/2006" xmlns:aink="http://schemas.microsoft.com/office/drawing/2016/ink" xmlns:am3d="http://schemas.microsoft.com/office/drawing/2017/model3d" xmlns:o="urn:schemas-microsoft-com:office:office" xmlns:oel="http://schemas.microsoft.com/office/2019/extlst" xmlns:r="http://schemas.openxmlformats.org/officeDocument/2006/relationships" xmlns:m="http://schemas.openxmlformats.org/officeDocument/2006/math" xmlns:v="urn:schemas-microsoft-com:vml" xmlns:wp14="http://schemas.microsoft.com/office/word/2010/wordprocessingDrawing" xmlns:wp="http://schemas.openxmlformats.org/drawingml/2006/wordprocessingDrawing" xmlns:w10="urn:schemas-microsoft-com:office:word" xmlns:w="http://schemas.openxmlformats.org/wordprocessingml/2006/main" xmlns:w14="http://schemas.microsoft.com/office/word/2010/wordml" xmlns:w15="http://schemas.microsoft.com/office/word/2012/wordml" xmlns:w16cei="http://schemas.microsoft.com/office/word/2026/wordml/cei" xmlns:w16cex="http://schemas.microsoft.com/office/word/2018/wordml/cex" xmlns:w16cid="http://schemas.microsoft.com/office/word/2016/wordml/cid" xmlns:w16="http://schemas.microsoft.com/office/word/2018/wordml" xmlns:w16du="http://schemas.microsoft.com/office/word/2023/wordml/word16du" xmlns:w16sdtdh="http://schemas.microsoft.com/office/word/2020/wordml/sdtdatahash" xmlns:w16sdtfl="http://schemas.microsoft.com/office/word/2024/wordml/sdtformatlock" xmlns:w16se="http://schemas.microsoft.com/office/word/2015/wordml/symex" xmlns:wpg="http://schemas.microsoft.com/office/word/2010/wordprocessingGroup" xmlns:wpi="http://schemas.microsoft.com/office/word/2010/wordprocessingInk" xmlns:wne="http://schemas.microsoft.com/office/word/2006/wordml" xmlns:wps="http://schemas.microsoft.com/office/word/2010/wordprocessingShape" mc:Ignorable="w14 w15 w16se w16cid w16 w16cex w16sdtdh w16sdtfl w16du wp14">
+  <w:endnote w:type="separator" w:id="-1">
+    <w:p>
+      <w:pPr>
+        <w:spacing w:after="0" w:line="240" w:lineRule="auto"/>
+      </w:pPr>
+      <w:r>
+        <w:separator/>
+      </w:r>
+    </w:p>
+  </w:endnote>
+  <w:endnote w:type="continuationSeparator" w:id="0">
+    <w:p>
+      <w:pPr>
+        <w:spacing w:after="0" w:line="240" w:lineRule="auto"/>
+      </w:pPr>
+      <w:r>
+        <w:continuationSeparator/>
+      </w:r>
+    </w:p>
+  </w:endnote>
+</w:endnotes>
+</file>
+
+<file path=word/footnotes.xml><?xml version="1.0" encoding="utf-8"?>
+<w:footnotes xmlns:wpc="http://schemas.microsoft.com/office/word/2010/wordprocessingCanvas" xmlns:cx="http://schemas.microsoft.com/office/drawing/2014/chartex" xmlns:cx1="http://schemas.microsoft.com/office/drawing/2015/9/8/chartex" xmlns:cx2="http://schemas.microsoft.com/office/drawing/2015/10/21/chartex" xmlns:cx3="http://schemas.microsoft.com/office/drawing/2016/5/9/chartex" xmlns:cx4="http://schemas.microsoft.com/office/drawing/2016/5/10/chartex" xmlns:cx5="http://schemas.microsoft.com/office/drawing/2016/5/11/chartex" xmlns:cx6="http://schemas.microsoft.com/office/drawing/2016/5/12/chartex" xmlns:cx7="http://schemas.microsoft.com/office/drawing/2016/5/13/chartex" xmlns:cx8="http://schemas.microsoft.com/office/drawing/2016/5/14/chartex" xmlns:mc="http://schemas.openxmlformats.org/markup-compatibility/2006" xmlns:aink="http://schemas.microsoft.com/office/drawing/2016/ink" xmlns:am3d="http://schemas.microsoft.com/office/drawing/2017/model3d" xmlns:o="urn:schemas-microsoft-com:office:office" xmlns:oel="http://schemas.microsoft.com/office/2019/extlst" xmlns:r="http://schemas.openxmlformats.org/officeDocument/2006/relationships" xmlns:m="http://schemas.openxmlformats.org/officeDocument/2006/math" xmlns:v="urn:schemas-microsoft-com:vml" xmlns:wp14="http://schemas.microsoft.com/office/word/2010/wordprocessingDrawing" xmlns:wp="http://schemas.openxmlformats.org/drawingml/2006/wordprocessingDrawing" xmlns:w10="urn:schemas-microsoft-com:office:word" xmlns:w="http://schemas.openxmlformats.org/wordprocessingml/2006/main" xmlns:w14="http://schemas.microsoft.com/office/word/2010/wordml" xmlns:w15="http://schemas.microsoft.com/office/word/2012/wordml" xmlns:w16cei="http://schemas.microsoft.com/office/word/2026/wordml/cei" xmlns:w16cex="http://schemas.microsoft.com/office/word/2018/wordml/cex" xmlns:w16cid="http://schemas.microsoft.com/office/word/2016/wordml/cid" xmlns:w16="http://schemas.microsoft.com/office/word/2018/wordml" xmlns:w16du="http://schemas.microsoft.com/office/word/2023/wordml/word16du" xmlns:w16sdtdh="http://schemas.microsoft.com/office/word/2020/wordml/sdtdatahash" xmlns:w16sdtfl="http://schemas.microsoft.com/office/word/2024/wordml/sdtformatlock" xmlns:w16se="http://schemas.microsoft.com/office/word/2015/wordml/symex" xmlns:wpg="http://schemas.microsoft.com/office/word/2010/wordprocessingGroup" xmlns:wpi="http://schemas.microsoft.com/office/word/2010/wordprocessingInk" xmlns:wne="http://schemas.microsoft.com/office/word/2006/wordml" xmlns:wps="http://schemas.microsoft.com/office/word/2010/wordprocessingShape" mc:Ignorable="w14 w15 w16se w16cid w16 w16cex w16sdtdh w16sdtfl w16du wp14">
+  <w:footnote w:type="separator" w:id="-1">
+    <w:p>
+      <w:pPr>
+        <w:spacing w:after="0" w:line="240" w:lineRule="auto"/>
+      </w:pPr>
+      <w:r>
+        <w:separator/>
+      </w:r>
+    </w:p>
+  </w:footnote>
+  <w:footnote w:type="continuationSeparator" w:id="0">
+    <w:p>
+      <w:pPr>
+        <w:spacing w:after="0" w:line="240" w:lineRule="auto"/>
+      </w:pPr>
+      <w:r>
+        <w:continuationSeparator/>
+      </w:r>
+    </w:p>
+  </w:footnote>
+</w:footnotes>
+</file>
+
 <file path=word/numbering.xml><?xml version="1.0" encoding="utf-8"?>
-<w:numbering xmlns:wpc="http://schemas.microsoft.com/office/word/2010/wordprocessingCanvas" xmlns:cx="http://schemas.microsoft.com/office/drawing/2014/chartex" xmlns:cx1="http://schemas.microsoft.com/office/drawing/2015/9/8/chartex" xmlns:cx2="http://schemas.microsoft.com/office/drawing/2015/10/21/chartex" xmlns:cx3="http://schemas.microsoft.com/office/drawing/2016/5/9/chartex" xmlns:cx4="http://schemas.microsoft.com/office/drawing/2016/5/10/chartex" xmlns:cx5="http://schemas.microsoft.com/office/drawing/2016/5/11/chartex" xmlns:cx6="http://schemas.microsoft.com/office/drawing/2016/5/12/chartex" xmlns:cx7="http://schemas.microsoft.com/office/drawing/2016/5/13/chartex" xmlns:cx8="http://schemas.microsoft.com/office/drawing/2016/5/14/chartex" xmlns:mc="http://schemas.openxmlformats.org/markup-compatibility/2006" xmlns:aink="http://schemas.microsoft.com/office/drawing/2016/ink" xmlns:am3d="http://schemas.microsoft.com/office/drawing/2017/model3d" xmlns:o="urn:schemas-microsoft-com:office:office" xmlns:oel="http://schemas.microsoft.com/office/2019/extlst" xmlns:r="http://schemas.openxmlformats.org/officeDocument/2006/relationships" xmlns:m="http://schemas.openxmlformats.org/officeDocument/2006/math" xmlns:v="urn:schemas-microsoft-com:vml" xmlns:wp14="http://schemas.microsoft.com/office/word/2010/wordprocessingDrawing" xmlns:wp="http://schemas.openxmlformats.org/drawingml/2006/wordprocessingDrawing" xmlns:w10="urn:schemas-microsoft-com:office:word" xmlns:w="http://schemas.openxmlformats.org/wordprocessingml/2006/main" xmlns:w14="http://schemas.microsoft.com/office/word/2010/wordml" xmlns:w15="http://schemas.microsoft.com/office/word/2012/wordml" xmlns:w16cex="http://schemas.microsoft.com/office/word/2018/wordml/cex" xmlns:w16cid="http://schemas.microsoft.com/office/word/2016/wordml/cid" xmlns:w16="http://schemas.microsoft.com/office/word/2018/wordml" xmlns:w16du="http://schemas.microsoft.com/office/word/2023/wordml/word16du" xmlns:w16sdtdh="http://schemas.microsoft.com/office/word/2020/wordml/sdtdatahash" xmlns:w16sdtfl="http://schemas.microsoft.com/office/word/2024/wordml/sdtformatlock" xmlns:w16se="http://schemas.microsoft.com/office/word/2015/wordml/symex" xmlns:wpg="http://schemas.microsoft.com/office/word/2010/wordprocessingGroup" xmlns:wpi="http://schemas.microsoft.com/office/word/2010/wordprocessingInk" xmlns:wne="http://schemas.microsoft.com/office/word/2006/wordml" xmlns:wps="http://schemas.microsoft.com/office/word/2010/wordprocessingShape" mc:Ignorable="w14 w15 w16se w16cid w16 w16cex w16sdtdh w16sdtfl w16du wp14">
+<w:numbering xmlns:wpc="http://schemas.microsoft.com/office/word/2010/wordprocessingCanvas" xmlns:cx="http://schemas.microsoft.com/office/drawing/2014/chartex" xmlns:cx1="http://schemas.microsoft.com/office/drawing/2015/9/8/chartex" xmlns:cx2="http://schemas.microsoft.com/office/drawing/2015/10/21/chartex" xmlns:cx3="http://schemas.microsoft.com/office/drawing/2016/5/9/chartex" xmlns:cx4="http://schemas.microsoft.com/office/drawing/2016/5/10/chartex" xmlns:cx5="http://schemas.microsoft.com/office/drawing/2016/5/11/chartex" xmlns:cx6="http://schemas.microsoft.com/office/drawing/2016/5/12/chartex" xmlns:cx7="http://schemas.microsoft.com/office/drawing/2016/5/13/chartex" xmlns:cx8="http://schemas.microsoft.com/office/drawing/2016/5/14/chartex" xmlns:mc="http://schemas.openxmlformats.org/markup-compatibility/2006" xmlns:aink="http://schemas.microsoft.com/office/drawing/2016/ink" xmlns:am3d="http://schemas.microsoft.com/office/drawing/2017/model3d" xmlns:o="urn:schemas-microsoft-com:office:office" xmlns:oel="http://schemas.microsoft.com/office/2019/extlst" xmlns:r="http://schemas.openxmlformats.org/officeDocument/2006/relationships" xmlns:m="http://schemas.openxmlformats.org/officeDocument/2006/math" xmlns:v="urn:schemas-microsoft-com:vml" xmlns:wp14="http://schemas.microsoft.com/office/word/2010/wordprocessingDrawing" xmlns:wp="http://schemas.openxmlformats.org/drawingml/2006/wordprocessingDrawing" xmlns:w10="urn:schemas-microsoft-com:office:word" xmlns:w="http://schemas.openxmlformats.org/wordprocessingml/2006/main" xmlns:w14="http://schemas.microsoft.com/office/word/2010/wordml" xmlns:w15="http://schemas.microsoft.com/office/word/2012/wordml" xmlns:w16cei="http://schemas.microsoft.com/office/word/2026/wordml/cei" xmlns:w16cex="http://schemas.microsoft.com/office/word/2018/wordml/cex" xmlns:w16cid="http://schemas.microsoft.com/office/word/2016/wordml/cid" xmlns:w16="http://schemas.microsoft.com/office/word/2018/wordml" xmlns:w16du="http://schemas.microsoft.com/office/word/2023/wordml/word16du" xmlns:w16sdtdh="http://schemas.microsoft.com/office/word/2020/wordml/sdtdatahash" xmlns:w16sdtfl="http://schemas.microsoft.com/office/word/2024/wordml/sdtformatlock" xmlns:w16se="http://schemas.microsoft.com/office/word/2015/wordml/symex" xmlns:wpg="http://schemas.microsoft.com/office/word/2010/wordprocessingGroup" xmlns:wpi="http://schemas.microsoft.com/office/word/2010/wordprocessingInk" xmlns:wne="http://schemas.microsoft.com/office/word/2006/wordml" xmlns:wps="http://schemas.microsoft.com/office/word/2010/wordprocessingShape" mc:Ignorable="w14 w15 w16se w16cid w16 w16cex w16sdtdh w16sdtfl w16du wp14">
   <w:abstractNum w:abstractNumId="0" w15:restartNumberingAfterBreak="0">
     <w:nsid w:val="FFFFFF7C"/>
     <w:multiLevelType w:val="singleLevel"/>
@@ -1680,6 +1950,121 @@
     </w:lvl>
   </w:abstractNum>
   <w:abstractNum w:abstractNumId="10" w15:restartNumberingAfterBreak="0">
+    <w:nsid w:val="12365CB0"/>
+    <w:multiLevelType w:val="hybridMultilevel"/>
+    <w:tmpl w:val="03AA0396"/>
+    <w:lvl w:ilvl="0" w:tplc="B9A0C36E">
+      <w:start w:val="1"/>
+      <w:numFmt w:val="bullet"/>
+      <w:lvlText w:val=""/>
+      <w:lvlJc w:val="left"/>
+      <w:pPr>
+        <w:ind w:left="720" w:hanging="360"/>
+      </w:pPr>
+      <w:rPr>
+        <w:rFonts w:ascii="Symbol" w:hAnsi="Symbol" w:hint="default"/>
+        <w:b w:val="0"/>
+        <w:bCs w:val="0"/>
+      </w:rPr>
+    </w:lvl>
+    <w:lvl w:ilvl="1" w:tplc="04090003" w:tentative="1">
+      <w:start w:val="1"/>
+      <w:numFmt w:val="bullet"/>
+      <w:lvlText w:val="o"/>
+      <w:lvlJc w:val="left"/>
+      <w:pPr>
+        <w:ind w:left="1440" w:hanging="360"/>
+      </w:pPr>
+      <w:rPr>
+        <w:rFonts w:ascii="Courier New" w:hAnsi="Courier New" w:cs="Courier New" w:hint="default"/>
+      </w:rPr>
+    </w:lvl>
+    <w:lvl w:ilvl="2" w:tplc="04090005" w:tentative="1">
+      <w:start w:val="1"/>
+      <w:numFmt w:val="bullet"/>
+      <w:lvlText w:val=""/>
+      <w:lvlJc w:val="left"/>
+      <w:pPr>
+        <w:ind w:left="2160" w:hanging="360"/>
+      </w:pPr>
+      <w:rPr>
+        <w:rFonts w:ascii="Wingdings" w:hAnsi="Wingdings" w:hint="default"/>
+      </w:rPr>
+    </w:lvl>
+    <w:lvl w:ilvl="3" w:tplc="04090001" w:tentative="1">
+      <w:start w:val="1"/>
+      <w:numFmt w:val="bullet"/>
+      <w:lvlText w:val=""/>
+      <w:lvlJc w:val="left"/>
+      <w:pPr>
+        <w:ind w:left="2880" w:hanging="360"/>
+      </w:pPr>
+      <w:rPr>
+        <w:rFonts w:ascii="Symbol" w:hAnsi="Symbol" w:hint="default"/>
+      </w:rPr>
+    </w:lvl>
+    <w:lvl w:ilvl="4" w:tplc="04090003" w:tentative="1">
+      <w:start w:val="1"/>
+      <w:numFmt w:val="bullet"/>
+      <w:lvlText w:val="o"/>
+      <w:lvlJc w:val="left"/>
+      <w:pPr>
+        <w:ind w:left="3600" w:hanging="360"/>
+      </w:pPr>
+      <w:rPr>
+        <w:rFonts w:ascii="Courier New" w:hAnsi="Courier New" w:cs="Courier New" w:hint="default"/>
+      </w:rPr>
+    </w:lvl>
+    <w:lvl w:ilvl="5" w:tplc="04090005" w:tentative="1">
+      <w:start w:val="1"/>
+      <w:numFmt w:val="bullet"/>
+      <w:lvlText w:val=""/>
+      <w:lvlJc w:val="left"/>
+      <w:pPr>
+        <w:ind w:left="4320" w:hanging="360"/>
+      </w:pPr>
+      <w:rPr>
+        <w:rFonts w:ascii="Wingdings" w:hAnsi="Wingdings" w:hint="default"/>
+      </w:rPr>
+    </w:lvl>
+    <w:lvl w:ilvl="6" w:tplc="04090001" w:tentative="1">
+      <w:start w:val="1"/>
+      <w:numFmt w:val="bullet"/>
+      <w:lvlText w:val=""/>
+      <w:lvlJc w:val="left"/>
+      <w:pPr>
+        <w:ind w:left="5040" w:hanging="360"/>
+      </w:pPr>
+      <w:rPr>
+        <w:rFonts w:ascii="Symbol" w:hAnsi="Symbol" w:hint="default"/>
+      </w:rPr>
+    </w:lvl>
+    <w:lvl w:ilvl="7" w:tplc="04090003" w:tentative="1">
+      <w:start w:val="1"/>
+      <w:numFmt w:val="bullet"/>
+      <w:lvlText w:val="o"/>
+      <w:lvlJc w:val="left"/>
+      <w:pPr>
+        <w:ind w:left="5760" w:hanging="360"/>
+      </w:pPr>
+      <w:rPr>
+        <w:rFonts w:ascii="Courier New" w:hAnsi="Courier New" w:cs="Courier New" w:hint="default"/>
+      </w:rPr>
+    </w:lvl>
+    <w:lvl w:ilvl="8" w:tplc="04090005" w:tentative="1">
+      <w:start w:val="1"/>
+      <w:numFmt w:val="bullet"/>
+      <w:lvlText w:val=""/>
+      <w:lvlJc w:val="left"/>
+      <w:pPr>
+        <w:ind w:left="6480" w:hanging="360"/>
+      </w:pPr>
+      <w:rPr>
+        <w:rFonts w:ascii="Wingdings" w:hAnsi="Wingdings" w:hint="default"/>
+      </w:rPr>
+    </w:lvl>
+  </w:abstractNum>
+  <w:abstractNum w:abstractNumId="11" w15:restartNumberingAfterBreak="0">
     <w:nsid w:val="3020799E"/>
     <w:multiLevelType w:val="hybridMultilevel"/>
     <w:tmpl w:val="D916B45E"/>
@@ -1792,7 +2177,7 @@
       </w:rPr>
     </w:lvl>
   </w:abstractNum>
-  <w:abstractNum w:abstractNumId="11" w15:restartNumberingAfterBreak="0">
+  <w:abstractNum w:abstractNumId="12" w15:restartNumberingAfterBreak="0">
     <w:nsid w:val="31246094"/>
     <w:multiLevelType w:val="hybridMultilevel"/>
     <w:tmpl w:val="A78C3A78"/>
@@ -1905,7 +2290,232 @@
       </w:rPr>
     </w:lvl>
   </w:abstractNum>
-  <w:abstractNum w:abstractNumId="12" w15:restartNumberingAfterBreak="0">
+  <w:abstractNum w:abstractNumId="13" w15:restartNumberingAfterBreak="0">
+    <w:nsid w:val="52A24A12"/>
+    <w:multiLevelType w:val="hybridMultilevel"/>
+    <w:tmpl w:val="9B7418BC"/>
+    <w:lvl w:ilvl="0" w:tplc="04090001">
+      <w:start w:val="1"/>
+      <w:numFmt w:val="bullet"/>
+      <w:lvlText w:val=""/>
+      <w:lvlJc w:val="left"/>
+      <w:pPr>
+        <w:ind w:left="720" w:hanging="360"/>
+      </w:pPr>
+      <w:rPr>
+        <w:rFonts w:ascii="Symbol" w:hAnsi="Symbol" w:hint="default"/>
+      </w:rPr>
+    </w:lvl>
+    <w:lvl w:ilvl="1" w:tplc="04090003" w:tentative="1">
+      <w:start w:val="1"/>
+      <w:numFmt w:val="bullet"/>
+      <w:lvlText w:val="o"/>
+      <w:lvlJc w:val="left"/>
+      <w:pPr>
+        <w:ind w:left="1440" w:hanging="360"/>
+      </w:pPr>
+      <w:rPr>
+        <w:rFonts w:ascii="Courier New" w:hAnsi="Courier New" w:cs="Courier New" w:hint="default"/>
+      </w:rPr>
+    </w:lvl>
+    <w:lvl w:ilvl="2" w:tplc="04090005" w:tentative="1">
+      <w:start w:val="1"/>
+      <w:numFmt w:val="bullet"/>
+      <w:lvlText w:val=""/>
+      <w:lvlJc w:val="left"/>
+      <w:pPr>
+        <w:ind w:left="2160" w:hanging="360"/>
+      </w:pPr>
+      <w:rPr>
+        <w:rFonts w:ascii="Wingdings" w:hAnsi="Wingdings" w:hint="default"/>
+      </w:rPr>
+    </w:lvl>
+    <w:lvl w:ilvl="3" w:tplc="04090001" w:tentative="1">
+      <w:start w:val="1"/>
+      <w:numFmt w:val="bullet"/>
+      <w:lvlText w:val=""/>
+      <w:lvlJc w:val="left"/>
+      <w:pPr>
+        <w:ind w:left="2880" w:hanging="360"/>
+      </w:pPr>
+      <w:rPr>
+        <w:rFonts w:ascii="Symbol" w:hAnsi="Symbol" w:hint="default"/>
+      </w:rPr>
+    </w:lvl>
+    <w:lvl w:ilvl="4" w:tplc="04090003" w:tentative="1">
+      <w:start w:val="1"/>
+      <w:numFmt w:val="bullet"/>
+      <w:lvlText w:val="o"/>
+      <w:lvlJc w:val="left"/>
+      <w:pPr>
+        <w:ind w:left="3600" w:hanging="360"/>
+      </w:pPr>
+      <w:rPr>
+        <w:rFonts w:ascii="Courier New" w:hAnsi="Courier New" w:cs="Courier New" w:hint="default"/>
+      </w:rPr>
+    </w:lvl>
+    <w:lvl w:ilvl="5" w:tplc="04090005" w:tentative="1">
+      <w:start w:val="1"/>
+      <w:numFmt w:val="bullet"/>
+      <w:lvlText w:val=""/>
+      <w:lvlJc w:val="left"/>
+      <w:pPr>
+        <w:ind w:left="4320" w:hanging="360"/>
+      </w:pPr>
+      <w:rPr>
+        <w:rFonts w:ascii="Wingdings" w:hAnsi="Wingdings" w:hint="default"/>
+      </w:rPr>
+    </w:lvl>
+    <w:lvl w:ilvl="6" w:tplc="04090001" w:tentative="1">
+      <w:start w:val="1"/>
+      <w:numFmt w:val="bullet"/>
+      <w:lvlText w:val=""/>
+      <w:lvlJc w:val="left"/>
+      <w:pPr>
+        <w:ind w:left="5040" w:hanging="360"/>
+      </w:pPr>
+      <w:rPr>
+        <w:rFonts w:ascii="Symbol" w:hAnsi="Symbol" w:hint="default"/>
+      </w:rPr>
+    </w:lvl>
+    <w:lvl w:ilvl="7" w:tplc="04090003" w:tentative="1">
+      <w:start w:val="1"/>
+      <w:numFmt w:val="bullet"/>
+      <w:lvlText w:val="o"/>
+      <w:lvlJc w:val="left"/>
+      <w:pPr>
+        <w:ind w:left="5760" w:hanging="360"/>
+      </w:pPr>
+      <w:rPr>
+        <w:rFonts w:ascii="Courier New" w:hAnsi="Courier New" w:cs="Courier New" w:hint="default"/>
+      </w:rPr>
+    </w:lvl>
+    <w:lvl w:ilvl="8" w:tplc="04090005" w:tentative="1">
+      <w:start w:val="1"/>
+      <w:numFmt w:val="bullet"/>
+      <w:lvlText w:val=""/>
+      <w:lvlJc w:val="left"/>
+      <w:pPr>
+        <w:ind w:left="6480" w:hanging="360"/>
+      </w:pPr>
+      <w:rPr>
+        <w:rFonts w:ascii="Wingdings" w:hAnsi="Wingdings" w:hint="default"/>
+      </w:rPr>
+    </w:lvl>
+  </w:abstractNum>
+  <w:abstractNum w:abstractNumId="14" w15:restartNumberingAfterBreak="0">
+    <w:nsid w:val="5F89640D"/>
+    <w:multiLevelType w:val="hybridMultilevel"/>
+    <w:tmpl w:val="DE12F5FE"/>
+    <w:lvl w:ilvl="0" w:tplc="D7FEE21C">
+      <w:numFmt w:val="bullet"/>
+      <w:lvlText w:val="•"/>
+      <w:lvlJc w:val="left"/>
+      <w:pPr>
+        <w:ind w:left="720" w:hanging="360"/>
+      </w:pPr>
+      <w:rPr>
+        <w:rFonts w:ascii="Garamond" w:eastAsia="Garamond" w:hAnsi="Garamond" w:cstheme="minorBidi" w:hint="default"/>
+      </w:rPr>
+    </w:lvl>
+    <w:lvl w:ilvl="1" w:tplc="04090003" w:tentative="1">
+      <w:start w:val="1"/>
+      <w:numFmt w:val="bullet"/>
+      <w:lvlText w:val="o"/>
+      <w:lvlJc w:val="left"/>
+      <w:pPr>
+        <w:ind w:left="1440" w:hanging="360"/>
+      </w:pPr>
+      <w:rPr>
+        <w:rFonts w:ascii="Courier New" w:hAnsi="Courier New" w:cs="Courier New" w:hint="default"/>
+      </w:rPr>
+    </w:lvl>
+    <w:lvl w:ilvl="2" w:tplc="04090005" w:tentative="1">
+      <w:start w:val="1"/>
+      <w:numFmt w:val="bullet"/>
+      <w:lvlText w:val=""/>
+      <w:lvlJc w:val="left"/>
+      <w:pPr>
+        <w:ind w:left="2160" w:hanging="360"/>
+      </w:pPr>
+      <w:rPr>
+        <w:rFonts w:ascii="Wingdings" w:hAnsi="Wingdings" w:hint="default"/>
+      </w:rPr>
+    </w:lvl>
+    <w:lvl w:ilvl="3" w:tplc="04090001" w:tentative="1">
+      <w:start w:val="1"/>
+      <w:numFmt w:val="bullet"/>
+      <w:lvlText w:val=""/>
+      <w:lvlJc w:val="left"/>
+      <w:pPr>
+        <w:ind w:left="2880" w:hanging="360"/>
+      </w:pPr>
+      <w:rPr>
+        <w:rFonts w:ascii="Symbol" w:hAnsi="Symbol" w:hint="default"/>
+      </w:rPr>
+    </w:lvl>
+    <w:lvl w:ilvl="4" w:tplc="04090003" w:tentative="1">
+      <w:start w:val="1"/>
+      <w:numFmt w:val="bullet"/>
+      <w:lvlText w:val="o"/>
+      <w:lvlJc w:val="left"/>
+      <w:pPr>
+        <w:ind w:left="3600" w:hanging="360"/>
+      </w:pPr>
+      <w:rPr>
+        <w:rFonts w:ascii="Courier New" w:hAnsi="Courier New" w:cs="Courier New" w:hint="default"/>
+      </w:rPr>
+    </w:lvl>
+    <w:lvl w:ilvl="5" w:tplc="04090005" w:tentative="1">
+      <w:start w:val="1"/>
+      <w:numFmt w:val="bullet"/>
+      <w:lvlText w:val=""/>
+      <w:lvlJc w:val="left"/>
+      <w:pPr>
+        <w:ind w:left="4320" w:hanging="360"/>
+      </w:pPr>
+      <w:rPr>
+        <w:rFonts w:ascii="Wingdings" w:hAnsi="Wingdings" w:hint="default"/>
+      </w:rPr>
+    </w:lvl>
+    <w:lvl w:ilvl="6" w:tplc="04090001" w:tentative="1">
+      <w:start w:val="1"/>
+      <w:numFmt w:val="bullet"/>
+      <w:lvlText w:val=""/>
+      <w:lvlJc w:val="left"/>
+      <w:pPr>
+        <w:ind w:left="5040" w:hanging="360"/>
+      </w:pPr>
+      <w:rPr>
+        <w:rFonts w:ascii="Symbol" w:hAnsi="Symbol" w:hint="default"/>
+      </w:rPr>
+    </w:lvl>
+    <w:lvl w:ilvl="7" w:tplc="04090003" w:tentative="1">
+      <w:start w:val="1"/>
+      <w:numFmt w:val="bullet"/>
+      <w:lvlText w:val="o"/>
+      <w:lvlJc w:val="left"/>
+      <w:pPr>
+        <w:ind w:left="5760" w:hanging="360"/>
+      </w:pPr>
+      <w:rPr>
+        <w:rFonts w:ascii="Courier New" w:hAnsi="Courier New" w:cs="Courier New" w:hint="default"/>
+      </w:rPr>
+    </w:lvl>
+    <w:lvl w:ilvl="8" w:tplc="04090005" w:tentative="1">
+      <w:start w:val="1"/>
+      <w:numFmt w:val="bullet"/>
+      <w:lvlText w:val=""/>
+      <w:lvlJc w:val="left"/>
+      <w:pPr>
+        <w:ind w:left="6480" w:hanging="360"/>
+      </w:pPr>
+      <w:rPr>
+        <w:rFonts w:ascii="Wingdings" w:hAnsi="Wingdings" w:hint="default"/>
+      </w:rPr>
+    </w:lvl>
+  </w:abstractNum>
+  <w:abstractNum w:abstractNumId="15" w15:restartNumberingAfterBreak="0">
     <w:nsid w:val="664E02E9"/>
     <w:multiLevelType w:val="hybridMultilevel"/>
     <w:tmpl w:val="67D8219E"/>
@@ -2046,16 +2656,25 @@
     <w:abstractNumId w:val="0"/>
   </w:num>
   <w:num w:numId="10" w16cid:durableId="1676104270">
-    <w:abstractNumId w:val="10"/>
+    <w:abstractNumId w:val="11"/>
   </w:num>
   <w:num w:numId="11" w16cid:durableId="1434324206">
-    <w:abstractNumId w:val="11"/>
+    <w:abstractNumId w:val="12"/>
   </w:num>
   <w:num w:numId="12" w16cid:durableId="596212273">
     <w:abstractNumId w:val="9"/>
   </w:num>
   <w:num w:numId="13" w16cid:durableId="2014793582">
-    <w:abstractNumId w:val="12"/>
+    <w:abstractNumId w:val="15"/>
+  </w:num>
+  <w:num w:numId="14" w16cid:durableId="201747930">
+    <w:abstractNumId w:val="10"/>
+  </w:num>
+  <w:num w:numId="15" w16cid:durableId="319312136">
+    <w:abstractNumId w:val="14"/>
+  </w:num>
+  <w:num w:numId="16" w16cid:durableId="872886303">
+    <w:abstractNumId w:val="13"/>
   </w:num>
 </w:numbering>
 </file>

</xml_diff>

<commit_message>
Update English and Chinese resumes
</commit_message>
<xml_diff>
--- a/docs/Asiah_Crutchfield_Resume.docx
+++ b/docs/Asiah_Crutchfield_Resume.docx
@@ -29,7 +29,47 @@
           <w:szCs w:val="48"/>
           <w:lang w:eastAsia="zh-CN"/>
         </w:rPr>
-        <w:t>(英) Asiah Crutchfield|(中) 孫</w:t>
+        <w:t>(英) Asiah Crutchfield</w:t>
+      </w:r>
+      <w:r>
+        <w:rPr>
+          <w:rFonts w:ascii="Gungsuh" w:eastAsia="Gungsuh" w:hAnsi="Gungsuh" w:cs="Gungsuh"/>
+          <w:b/>
+          <w:sz w:val="48"/>
+          <w:szCs w:val="48"/>
+          <w:lang w:eastAsia="zh-CN"/>
+        </w:rPr>
+        <w:t xml:space="preserve"> </w:t>
+      </w:r>
+      <w:r>
+        <w:rPr>
+          <w:rFonts w:ascii="Gungsuh" w:eastAsia="Gungsuh" w:hAnsi="Gungsuh" w:cs="Gungsuh"/>
+          <w:b/>
+          <w:sz w:val="48"/>
+          <w:szCs w:val="48"/>
+          <w:lang w:eastAsia="zh-CN"/>
+        </w:rPr>
+        <w:t>|</w:t>
+      </w:r>
+      <w:r>
+        <w:rPr>
+          <w:rFonts w:ascii="Gungsuh" w:eastAsia="Gungsuh" w:hAnsi="Gungsuh" w:cs="Gungsuh"/>
+          <w:b/>
+          <w:sz w:val="48"/>
+          <w:szCs w:val="48"/>
+          <w:lang w:eastAsia="zh-CN"/>
+        </w:rPr>
+        <w:t xml:space="preserve"> </w:t>
+      </w:r>
+      <w:r>
+        <w:rPr>
+          <w:rFonts w:ascii="Gungsuh" w:eastAsia="Gungsuh" w:hAnsi="Gungsuh" w:cs="Gungsuh"/>
+          <w:b/>
+          <w:sz w:val="48"/>
+          <w:szCs w:val="48"/>
+          <w:lang w:eastAsia="zh-CN"/>
+        </w:rPr>
+        <w:t>(中) 孫</w:t>
       </w:r>
       <w:r>
         <w:rPr>
@@ -332,236 +372,32 @@
     </w:p>
     <w:tbl>
       <w:tblPr>
-        <w:tblW w:w="11106" w:type="dxa"/>
-        <w:jc w:val="center"/>
-        <w:tblBorders>
-          <w:top w:val="nil"/>
-          <w:left w:val="nil"/>
-          <w:bottom w:val="nil"/>
-          <w:right w:val="nil"/>
-          <w:insideH w:val="nil"/>
-          <w:insideV w:val="nil"/>
-        </w:tblBorders>
-        <w:tblLayout w:type="fixed"/>
+        <w:tblW w:w="10805" w:type="dxa"/>
+        <w:shd w:val="clear" w:color="auto" w:fill="FFFFFF"/>
         <w:tblLook w:val="04A0" w:firstRow="1" w:lastRow="0" w:firstColumn="1" w:lastColumn="0" w:noHBand="0" w:noVBand="1"/>
       </w:tblPr>
       <w:tblGrid>
-        <w:gridCol w:w="8226"/>
-        <w:gridCol w:w="2727"/>
-        <w:gridCol w:w="153"/>
+        <w:gridCol w:w="5447"/>
+        <w:gridCol w:w="5358"/>
       </w:tblGrid>
       <w:tr>
         <w:trPr>
-          <w:gridAfter w:val="1"/>
-          <w:wAfter w:w="153" w:type="dxa"/>
-          <w:jc w:val="center"/>
+          <w:trHeight w:val="135"/>
         </w:trPr>
         <w:tc>
           <w:tcPr>
-            <w:tcW w:w="8226" w:type="dxa"/>
+            <w:tcW w:w="5447" w:type="dxa"/>
+            <w:shd w:val="clear" w:color="auto" w:fill="FFFFFF"/>
+            <w:tcMar>
+              <w:top w:w="0" w:type="dxa"/>
+              <w:left w:w="0" w:type="dxa"/>
+              <w:bottom w:w="0" w:type="dxa"/>
+              <w:right w:w="0" w:type="dxa"/>
+            </w:tcMar>
+            <w:hideMark/>
           </w:tcPr>
-          <w:tbl>
-            <w:tblPr>
-              <w:tblW w:w="5636" w:type="dxa"/>
-              <w:tblBorders>
-                <w:top w:val="single" w:sz="2" w:space="0" w:color="auto"/>
-                <w:left w:val="single" w:sz="2" w:space="0" w:color="auto"/>
-                <w:bottom w:val="single" w:sz="2" w:space="0" w:color="auto"/>
-                <w:right w:val="single" w:sz="2" w:space="0" w:color="auto"/>
-              </w:tblBorders>
-              <w:shd w:val="clear" w:color="auto" w:fill="FFFFFF"/>
-              <w:tblLook w:val="04A0" w:firstRow="1" w:lastRow="0" w:firstColumn="1" w:lastColumn="0" w:noHBand="0" w:noVBand="1"/>
-            </w:tblPr>
-            <w:tblGrid>
-              <w:gridCol w:w="5400"/>
-              <w:gridCol w:w="236"/>
-            </w:tblGrid>
-            <w:tr>
-              <w:tc>
-                <w:tcPr>
-                  <w:tcW w:w="5400" w:type="dxa"/>
-                  <w:tcBorders>
-                    <w:top w:val="nil"/>
-                    <w:left w:val="nil"/>
-                    <w:bottom w:val="nil"/>
-                    <w:right w:val="nil"/>
-                  </w:tcBorders>
-                  <w:shd w:val="clear" w:color="auto" w:fill="FFFFFF"/>
-                  <w:tcMar>
-                    <w:top w:w="0" w:type="dxa"/>
-                    <w:left w:w="0" w:type="dxa"/>
-                    <w:bottom w:w="0" w:type="dxa"/>
-                    <w:right w:w="0" w:type="dxa"/>
-                  </w:tcMar>
-                  <w:hideMark/>
-                </w:tcPr>
-                <w:p>
-                  <w:pPr>
-                    <w:spacing w:after="0" w:line="240" w:lineRule="auto"/>
-                    <w:rPr>
-                      <w:b/>
-                      <w:sz w:val="24"/>
-                      <w:szCs w:val="24"/>
-                    </w:rPr>
-                  </w:pPr>
-                  <w:r>
-                    <w:rPr>
-                      <w:b/>
-                      <w:bCs/>
-                      <w:sz w:val="24"/>
-                      <w:szCs w:val="24"/>
-                    </w:rPr>
-                    <w:t>8-Bit CPU Architecture &amp; Simulation</w:t>
-                  </w:r>
-                </w:p>
-              </w:tc>
-              <w:tc>
-                <w:tcPr>
-                  <w:tcW w:w="236" w:type="dxa"/>
-                  <w:tcBorders>
-                    <w:top w:val="nil"/>
-                    <w:left w:val="nil"/>
-                    <w:bottom w:val="nil"/>
-                    <w:right w:val="nil"/>
-                  </w:tcBorders>
-                  <w:shd w:val="clear" w:color="auto" w:fill="FFFFFF"/>
-                </w:tcPr>
-                <w:p>
-                  <w:pPr>
-                    <w:spacing w:after="0" w:line="240" w:lineRule="auto"/>
-                    <w:rPr>
-                      <w:b/>
-                      <w:sz w:val="24"/>
-                      <w:szCs w:val="24"/>
-                    </w:rPr>
-                  </w:pPr>
-                </w:p>
-              </w:tc>
-            </w:tr>
-            <w:tr>
-              <w:tc>
-                <w:tcPr>
-                  <w:tcW w:w="5400" w:type="dxa"/>
-                  <w:tcBorders>
-                    <w:top w:val="nil"/>
-                    <w:left w:val="nil"/>
-                    <w:bottom w:val="nil"/>
-                    <w:right w:val="nil"/>
-                  </w:tcBorders>
-                  <w:shd w:val="clear" w:color="auto" w:fill="FFFFFF"/>
-                  <w:tcMar>
-                    <w:top w:w="0" w:type="dxa"/>
-                    <w:left w:w="0" w:type="dxa"/>
-                    <w:bottom w:w="0" w:type="dxa"/>
-                    <w:right w:w="0" w:type="dxa"/>
-                  </w:tcMar>
-                </w:tcPr>
-                <w:p>
-                  <w:pPr>
-                    <w:spacing w:after="0" w:line="240" w:lineRule="auto"/>
-                    <w:rPr>
-                      <w:b/>
-                      <w:bCs/>
-                      <w:i/>
-                      <w:iCs/>
-                      <w:sz w:val="24"/>
-                      <w:szCs w:val="24"/>
-                    </w:rPr>
-                  </w:pPr>
-                  <w:r>
-                    <w:rPr>
-                      <w:bCs/>
-                      <w:i/>
-                      <w:iCs/>
-                      <w:sz w:val="24"/>
-                      <w:szCs w:val="24"/>
-                    </w:rPr>
-                    <w:t>Self-Directed</w:t>
-                  </w:r>
-                  <w:r>
-                    <w:rPr>
-                      <w:bCs/>
-                      <w:i/>
-                      <w:iCs/>
-                      <w:sz w:val="24"/>
-                      <w:szCs w:val="24"/>
-                    </w:rPr>
-                    <w:t xml:space="preserve"> Computer Architecture Project</w:t>
-                  </w:r>
-                </w:p>
-              </w:tc>
-              <w:tc>
-                <w:tcPr>
-                  <w:tcW w:w="236" w:type="dxa"/>
-                  <w:tcBorders>
-                    <w:top w:val="nil"/>
-                    <w:left w:val="nil"/>
-                    <w:bottom w:val="nil"/>
-                    <w:right w:val="nil"/>
-                  </w:tcBorders>
-                  <w:shd w:val="clear" w:color="auto" w:fill="FFFFFF"/>
-                </w:tcPr>
-                <w:p>
-                  <w:pPr>
-                    <w:spacing w:after="0" w:line="240" w:lineRule="auto"/>
-                    <w:rPr>
-                      <w:b/>
-                      <w:sz w:val="24"/>
-                      <w:szCs w:val="24"/>
-                    </w:rPr>
-                  </w:pPr>
-                </w:p>
-              </w:tc>
-            </w:tr>
-          </w:tbl>
           <w:p>
             <w:pPr>
-              <w:pStyle w:val="ListParagraph"/>
-              <w:numPr>
-                <w:ilvl w:val="0"/>
-                <w:numId w:val="14"/>
-              </w:numPr>
-              <w:spacing w:after="0" w:line="240" w:lineRule="auto"/>
-              <w:rPr>
-                <w:bCs/>
-                <w:sz w:val="24"/>
-                <w:szCs w:val="24"/>
-              </w:rPr>
-            </w:pPr>
-            <w:r>
-              <w:rPr>
-                <w:bCs/>
-                <w:sz w:val="24"/>
-                <w:szCs w:val="24"/>
-              </w:rPr>
-              <w:t xml:space="preserve">Built and simulated </w:t>
-            </w:r>
-            <w:proofErr w:type="gramStart"/>
-            <w:r>
-              <w:rPr>
-                <w:bCs/>
-                <w:sz w:val="24"/>
-                <w:szCs w:val="24"/>
-              </w:rPr>
-              <w:t>a</w:t>
-            </w:r>
-            <w:proofErr w:type="gramEnd"/>
-            <w:r>
-              <w:rPr>
-                <w:bCs/>
-                <w:sz w:val="24"/>
-                <w:szCs w:val="24"/>
-              </w:rPr>
-              <w:t xml:space="preserve"> SAP-1-inspired 8-bit CPU from digital logic components to explore computer architecture at the binary level.</w:t>
-            </w:r>
-          </w:p>
-          <w:p>
-            <w:pPr>
-              <w:pStyle w:val="ListParagraph"/>
-              <w:numPr>
-                <w:ilvl w:val="0"/>
-                <w:numId w:val="14"/>
-              </w:numPr>
               <w:spacing w:after="0" w:line="240" w:lineRule="auto"/>
               <w:rPr>
                 <w:b/>
@@ -571,30 +407,23 @@
             </w:pPr>
             <w:r>
               <w:rPr>
+                <w:b/>
                 <w:bCs/>
                 <w:sz w:val="24"/>
                 <w:szCs w:val="24"/>
               </w:rPr>
-              <w:t>Implemented an 8-bit ALU for binary addition/subtraction, plus registers, RAM, and a program counter using latches and flip-flops</w:t>
-            </w:r>
-            <w:r>
-              <w:rPr>
-                <w:b/>
-                <w:sz w:val="24"/>
-                <w:szCs w:val="24"/>
-              </w:rPr>
-              <w:t>.</w:t>
+              <w:t>8-Bit CPU Architecture &amp; Simulation</w:t>
             </w:r>
           </w:p>
         </w:tc>
         <w:tc>
           <w:tcPr>
-            <w:tcW w:w="2727" w:type="dxa"/>
+            <w:tcW w:w="5358" w:type="dxa"/>
+            <w:shd w:val="clear" w:color="auto" w:fill="FFFFFF"/>
           </w:tcPr>
           <w:p>
             <w:pPr>
               <w:spacing w:after="0" w:line="240" w:lineRule="auto"/>
-              <w:ind w:right="-75"/>
               <w:jc w:val="right"/>
               <w:rPr>
                 <w:b/>
@@ -631,11 +460,148 @@
       </w:tr>
       <w:tr>
         <w:trPr>
+          <w:trHeight w:val="135"/>
+        </w:trPr>
+        <w:tc>
+          <w:tcPr>
+            <w:tcW w:w="5447" w:type="dxa"/>
+            <w:shd w:val="clear" w:color="auto" w:fill="FFFFFF"/>
+            <w:tcMar>
+              <w:top w:w="0" w:type="dxa"/>
+              <w:left w:w="0" w:type="dxa"/>
+              <w:bottom w:w="0" w:type="dxa"/>
+              <w:right w:w="0" w:type="dxa"/>
+            </w:tcMar>
+          </w:tcPr>
+          <w:p>
+            <w:pPr>
+              <w:spacing w:after="0" w:line="240" w:lineRule="auto"/>
+              <w:rPr>
+                <w:b/>
+                <w:bCs/>
+                <w:sz w:val="24"/>
+                <w:szCs w:val="24"/>
+              </w:rPr>
+            </w:pPr>
+            <w:r>
+              <w:rPr>
+                <w:bCs/>
+                <w:i/>
+                <w:iCs/>
+                <w:sz w:val="24"/>
+                <w:szCs w:val="24"/>
+              </w:rPr>
+              <w:t>Self-Directed</w:t>
+            </w:r>
+            <w:r>
+              <w:rPr>
+                <w:bCs/>
+                <w:i/>
+                <w:iCs/>
+                <w:sz w:val="24"/>
+                <w:szCs w:val="24"/>
+              </w:rPr>
+              <w:t xml:space="preserve"> Computer Architecture Project</w:t>
+            </w:r>
+          </w:p>
+        </w:tc>
+        <w:tc>
+          <w:tcPr>
+            <w:tcW w:w="5358" w:type="dxa"/>
+            <w:shd w:val="clear" w:color="auto" w:fill="FFFFFF"/>
+          </w:tcPr>
+          <w:p>
+            <w:pPr>
+              <w:spacing w:after="0" w:line="240" w:lineRule="auto"/>
+              <w:rPr>
+                <w:b/>
+                <w:bCs/>
+                <w:sz w:val="24"/>
+                <w:szCs w:val="24"/>
+              </w:rPr>
+            </w:pPr>
+          </w:p>
+        </w:tc>
+      </w:tr>
+    </w:tbl>
+    <w:p>
+      <w:pPr>
+        <w:pStyle w:val="ListParagraph"/>
+        <w:numPr>
+          <w:ilvl w:val="0"/>
+          <w:numId w:val="14"/>
+        </w:numPr>
+        <w:spacing w:after="0" w:line="240" w:lineRule="auto"/>
+      </w:pPr>
+      <w:r>
+        <w:rPr>
+          <w:bCs/>
+          <w:sz w:val="24"/>
+          <w:szCs w:val="24"/>
+        </w:rPr>
+        <w:t xml:space="preserve">Designed and simulated </w:t>
+      </w:r>
+      <w:r>
+        <w:rPr>
+          <w:bCs/>
+          <w:sz w:val="24"/>
+          <w:szCs w:val="24"/>
+        </w:rPr>
+        <w:t>an</w:t>
+      </w:r>
+      <w:r>
+        <w:rPr>
+          <w:bCs/>
+          <w:sz w:val="24"/>
+          <w:szCs w:val="24"/>
+        </w:rPr>
+        <w:t xml:space="preserve"> SAP-1-inspired 8-bit CPU to analyze system-level computer architecture.</w:t>
+      </w:r>
+    </w:p>
+    <w:p>
+      <w:pPr>
+        <w:pStyle w:val="ListParagraph"/>
+        <w:numPr>
+          <w:ilvl w:val="0"/>
+          <w:numId w:val="14"/>
+        </w:numPr>
+        <w:spacing w:after="0" w:line="240" w:lineRule="auto"/>
+      </w:pPr>
+      <w:r>
+        <w:rPr>
+          <w:bCs/>
+          <w:sz w:val="24"/>
+          <w:szCs w:val="24"/>
+        </w:rPr>
+        <w:t>Implemented an 8-bit ALU for binary addition/subtraction, plus registers, RAM, and a program counter using latches and flip-flops</w:t>
+      </w:r>
+      <w:r>
+        <w:rPr>
+          <w:b/>
+          <w:sz w:val="24"/>
+          <w:szCs w:val="24"/>
+        </w:rPr>
+        <w:t>.</w:t>
+      </w:r>
+    </w:p>
+    <w:tbl>
+      <w:tblPr>
+        <w:tblW w:w="10725" w:type="dxa"/>
+        <w:jc w:val="center"/>
+        <w:tblLayout w:type="fixed"/>
+        <w:tblLook w:val="04A0" w:firstRow="1" w:lastRow="0" w:firstColumn="1" w:lastColumn="0" w:noHBand="0" w:noVBand="1"/>
+      </w:tblPr>
+      <w:tblGrid>
+        <w:gridCol w:w="7908"/>
+        <w:gridCol w:w="2817"/>
+      </w:tblGrid>
+      <w:tr>
+        <w:trPr>
           <w:jc w:val="center"/>
         </w:trPr>
         <w:tc>
           <w:tcPr>
-            <w:tcW w:w="8226" w:type="dxa"/>
+            <w:tcW w:w="7908" w:type="dxa"/>
           </w:tcPr>
           <w:p>
             <w:pPr>
@@ -657,28 +623,39 @@
         </w:tc>
         <w:tc>
           <w:tcPr>
-            <w:tcW w:w="2880" w:type="dxa"/>
-            <w:gridSpan w:val="2"/>
+            <w:tcW w:w="2817" w:type="dxa"/>
           </w:tcPr>
           <w:p>
             <w:pPr>
               <w:spacing w:after="0" w:line="240" w:lineRule="auto"/>
               <w:jc w:val="right"/>
               <w:rPr>
+                <w:b/>
+                <w:bCs/>
                 <w:sz w:val="24"/>
                 <w:szCs w:val="24"/>
               </w:rPr>
             </w:pPr>
+            <w:r>
+              <w:rPr>
+                <w:b/>
+                <w:bCs/>
+                <w:sz w:val="24"/>
+                <w:szCs w:val="24"/>
+              </w:rPr>
+              <w:t>2026</w:t>
+            </w:r>
           </w:p>
         </w:tc>
       </w:tr>
       <w:tr>
         <w:trPr>
+          <w:trHeight w:val="70"/>
           <w:jc w:val="center"/>
         </w:trPr>
         <w:tc>
           <w:tcPr>
-            <w:tcW w:w="8226" w:type="dxa"/>
+            <w:tcW w:w="7908" w:type="dxa"/>
           </w:tcPr>
           <w:p>
             <w:pPr>
@@ -700,8 +677,7 @@
         </w:tc>
         <w:tc>
           <w:tcPr>
-            <w:tcW w:w="2880" w:type="dxa"/>
-            <w:gridSpan w:val="2"/>
+            <w:tcW w:w="2817" w:type="dxa"/>
           </w:tcPr>
           <w:p>
             <w:pPr>
@@ -739,21 +715,13 @@
     </w:p>
     <w:tbl>
       <w:tblPr>
-        <w:tblW w:w="11106" w:type="dxa"/>
+        <w:tblW w:w="10748" w:type="dxa"/>
         <w:jc w:val="center"/>
-        <w:tblBorders>
-          <w:top w:val="nil"/>
-          <w:left w:val="nil"/>
-          <w:bottom w:val="nil"/>
-          <w:right w:val="nil"/>
-          <w:insideH w:val="nil"/>
-          <w:insideV w:val="nil"/>
-        </w:tblBorders>
         <w:tblLayout w:type="fixed"/>
         <w:tblLook w:val="04A0" w:firstRow="1" w:lastRow="0" w:firstColumn="1" w:lastColumn="0" w:noHBand="0" w:noVBand="1"/>
       </w:tblPr>
       <w:tblGrid>
-        <w:gridCol w:w="8226"/>
+        <w:gridCol w:w="7868"/>
         <w:gridCol w:w="2880"/>
       </w:tblGrid>
       <w:tr>
@@ -762,7 +730,7 @@
         </w:trPr>
         <w:tc>
           <w:tcPr>
-            <w:tcW w:w="8226" w:type="dxa"/>
+            <w:tcW w:w="7868" w:type="dxa"/>
           </w:tcPr>
           <w:p>
             <w:pPr>
@@ -820,7 +788,7 @@
         </w:trPr>
         <w:tc>
           <w:tcPr>
-            <w:tcW w:w="8226" w:type="dxa"/>
+            <w:tcW w:w="7868" w:type="dxa"/>
           </w:tcPr>
           <w:p>
             <w:pPr>
@@ -880,21 +848,13 @@
     </w:p>
     <w:tbl>
       <w:tblPr>
-        <w:tblW w:w="11106" w:type="dxa"/>
+        <w:tblW w:w="10695" w:type="dxa"/>
         <w:jc w:val="center"/>
-        <w:tblBorders>
-          <w:top w:val="nil"/>
-          <w:left w:val="nil"/>
-          <w:bottom w:val="nil"/>
-          <w:right w:val="nil"/>
-          <w:insideH w:val="nil"/>
-          <w:insideV w:val="nil"/>
-        </w:tblBorders>
         <w:tblLayout w:type="fixed"/>
         <w:tblLook w:val="04A0" w:firstRow="1" w:lastRow="0" w:firstColumn="1" w:lastColumn="0" w:noHBand="0" w:noVBand="1"/>
       </w:tblPr>
       <w:tblGrid>
-        <w:gridCol w:w="8226"/>
+        <w:gridCol w:w="7815"/>
         <w:gridCol w:w="2880"/>
       </w:tblGrid>
       <w:tr>
@@ -903,7 +863,7 @@
         </w:trPr>
         <w:tc>
           <w:tcPr>
-            <w:tcW w:w="8226" w:type="dxa"/>
+            <w:tcW w:w="7815" w:type="dxa"/>
           </w:tcPr>
           <w:p>
             <w:pPr>
@@ -961,7 +921,7 @@
         </w:trPr>
         <w:tc>
           <w:tcPr>
-            <w:tcW w:w="8226" w:type="dxa"/>
+            <w:tcW w:w="7815" w:type="dxa"/>
           </w:tcPr>
           <w:p>
             <w:pPr>
@@ -1005,7 +965,7 @@
           <w:ilvl w:val="0"/>
           <w:numId w:val="16"/>
         </w:numPr>
-        <w:spacing w:before="80" w:after="0" w:line="240" w:lineRule="auto"/>
+        <w:spacing w:after="0" w:line="240" w:lineRule="auto"/>
         <w:rPr>
           <w:b/>
           <w:sz w:val="24"/>
@@ -1066,7 +1026,14 @@
           <w:sz w:val="24"/>
           <w:szCs w:val="24"/>
         </w:rPr>
-        <w:t>Languages: JavaScript, TypeScript, HTML, CSS; C++ and Python (coursework/basic)</w:t>
+        <w:t xml:space="preserve">Languages: </w:t>
+      </w:r>
+      <w:r>
+        <w:rPr>
+          <w:sz w:val="24"/>
+          <w:szCs w:val="24"/>
+        </w:rPr>
+        <w:t>Python, C++, JavaScript, TypeScript</w:t>
       </w:r>
     </w:p>
     <w:p>
@@ -1087,14 +1054,14 @@
           <w:sz w:val="24"/>
           <w:szCs w:val="24"/>
         </w:rPr>
-        <w:t>Tools: Git, GitHub, VS Code, Excel, Windows, macOS, Vite</w:t>
+        <w:t xml:space="preserve">Tools: </w:t>
       </w:r>
       <w:r>
         <w:rPr>
           <w:sz w:val="24"/>
           <w:szCs w:val="24"/>
         </w:rPr>
-        <w:t>, Digital</w:t>
+        <w:t>Digital Logic Simulator, Git, GitHub, VS Code, Excel</w:t>
       </w:r>
     </w:p>
     <w:p>
@@ -1115,7 +1082,7 @@
           <w:sz w:val="24"/>
           <w:szCs w:val="24"/>
         </w:rPr>
-        <w:t>Technical Areas</w:t>
+        <w:t>Core Competencies</w:t>
       </w:r>
       <w:r>
         <w:rPr>
@@ -1129,7 +1096,14 @@
           <w:sz w:val="24"/>
           <w:szCs w:val="24"/>
         </w:rPr>
-        <w:t>Frontend Development, JSON/Data Workflows, Computer Architecture, QA/Testing</w:t>
+        <w:t xml:space="preserve">Frontend Development, </w:t>
+      </w:r>
+      <w:r>
+        <w:rPr>
+          <w:sz w:val="24"/>
+          <w:szCs w:val="24"/>
+        </w:rPr>
+        <w:t>Computer Architecture, Logic Verification, System Debugging, QA/Testing</w:t>
       </w:r>
       <w:r>
         <w:rPr>
@@ -2017,8 +1991,8 @@
   <w:abstractNum w:abstractNumId="10" w15:restartNumberingAfterBreak="0">
     <w:nsid w:val="12365CB0"/>
     <w:multiLevelType w:val="hybridMultilevel"/>
-    <w:tmpl w:val="03AA0396"/>
-    <w:lvl w:ilvl="0" w:tplc="B9A0C36E">
+    <w:tmpl w:val="ADFC4404"/>
+    <w:lvl w:ilvl="0" w:tplc="9C74881C">
       <w:start w:val="1"/>
       <w:numFmt w:val="bullet"/>
       <w:lvlText w:val=""/>
@@ -2030,6 +2004,8 @@
         <w:rFonts w:ascii="Symbol" w:hAnsi="Symbol" w:hint="default"/>
         <w:b w:val="0"/>
         <w:bCs w:val="0"/>
+        <w:sz w:val="24"/>
+        <w:szCs w:val="24"/>
       </w:rPr>
     </w:lvl>
     <w:lvl w:ilvl="1" w:tplc="04090003" w:tentative="1">
@@ -3351,7 +3327,6 @@
   <w:style w:type="character" w:default="1" w:styleId="DefaultParagraphFont">
     <w:name w:val="Default Paragraph Font"/>
     <w:uiPriority w:val="1"/>
-    <w:semiHidden/>
     <w:unhideWhenUsed/>
   </w:style>
   <w:style w:type="table" w:default="1" w:styleId="TableNormal">

</xml_diff>

<commit_message>
Updated English and Chinese resumes
</commit_message>
<xml_diff>
--- a/docs/Asiah_Crutchfield_Resume.docx
+++ b/docs/Asiah_Crutchfield_Resume.docx
@@ -321,14 +321,14 @@
           <w:sz w:val="24"/>
           <w:szCs w:val="24"/>
         </w:rPr>
-        <w:t>Software | Computer Architecture | IT Support | QA/Testing</w:t>
+        <w:t>S</w:t>
       </w:r>
       <w:r>
         <w:rPr>
           <w:sz w:val="24"/>
           <w:szCs w:val="24"/>
         </w:rPr>
-        <w:t xml:space="preserve"> | AI</w:t>
+        <w:t>oftware Development | Computer Architecture | System Debugging | QA/Testing</w:t>
       </w:r>
     </w:p>
     <w:p>
@@ -539,7 +539,7 @@
           <w:sz w:val="24"/>
           <w:szCs w:val="24"/>
         </w:rPr>
-        <w:t xml:space="preserve">Designed and simulated </w:t>
+        <w:t>Built</w:t>
       </w:r>
       <w:r>
         <w:rPr>
@@ -547,15 +547,7 @@
           <w:sz w:val="24"/>
           <w:szCs w:val="24"/>
         </w:rPr>
-        <w:t>an</w:t>
-      </w:r>
-      <w:r>
-        <w:rPr>
-          <w:bCs/>
-          <w:sz w:val="24"/>
-          <w:szCs w:val="24"/>
-        </w:rPr>
-        <w:t xml:space="preserve"> SAP-1-inspired 8-bit CPU to analyze system-level computer architecture.</w:t>
+        <w:t xml:space="preserve"> and simulated an SAP-1-inspired 8-bit CPU to analyze system-level computer architecture.</w:t>
       </w:r>
     </w:p>
     <w:p>
@@ -1211,7 +1203,6 @@
                 <w:szCs w:val="24"/>
               </w:rPr>
             </w:pPr>
-            <w:proofErr w:type="gramStart"/>
             <w:r>
               <w:rPr>
                 <w:i/>
@@ -1220,7 +1211,6 @@
               </w:rPr>
               <w:t>Bachelor's in Informatics</w:t>
             </w:r>
-            <w:proofErr w:type="gramEnd"/>
           </w:p>
         </w:tc>
         <w:tc>

</xml_diff>